<commit_message>
added muunto case study
</commit_message>
<xml_diff>
--- a/projects/Andrea - UX Resume.docx
+++ b/projects/Andrea - UX Resume.docx
@@ -23,70 +23,45 @@
           <w:b/>
           <w:bCs/>
         </w:rPr>
-        <w:t>Product Designer | UX/UI | Front-End Development</w:t>
-      </w:r>
-    </w:p>
-    <w:p>
-      <w:r>
+        <w:t>UI/UX Designer | Digital &amp; Product Design</w:t>
+      </w:r>
+      <w:r>
+        <w:br/>
         <w:t>Remote, IN</w:t>
       </w:r>
       <w:r>
         <w:br/>
-      </w:r>
-      <w:hyperlink r:id="rId7" w:history="1">
+        <w:t>almarch3@asu.edu</w:t>
+      </w:r>
+      <w:r>
+        <w:br/>
+        <w:t xml:space="preserve">Portfolio: </w:t>
+      </w:r>
+      <w:hyperlink r:id="rId7" w:tgtFrame="_new" w:history="1">
         <w:r>
           <w:rPr>
             <w:rStyle w:val="Hyperlink"/>
           </w:rPr>
-          <w:t>almarch3@asu.edu</w:t>
+          <w:t>https://almarch3.github.io/andreamarchant/</w:t>
         </w:r>
       </w:hyperlink>
       <w:r>
-        <w:t xml:space="preserve"> </w:t>
-      </w:r>
-      <w:r>
         <w:br/>
-        <w:t xml:space="preserve">Portfolio: </w:t>
-      </w:r>
-      <w:hyperlink r:id="rId8" w:history="1">
+        <w:t xml:space="preserve">LinkedIn: </w:t>
+      </w:r>
+      <w:hyperlink r:id="rId8" w:tgtFrame="_new" w:history="1">
         <w:r>
           <w:rPr>
             <w:rStyle w:val="Hyperlink"/>
           </w:rPr>
-          <w:t>almarch3.github.io/</w:t>
-        </w:r>
-        <w:proofErr w:type="spellStart"/>
-        <w:r>
-          <w:rPr>
-            <w:rStyle w:val="Hyperlink"/>
-          </w:rPr>
-          <w:t>andreamarchant</w:t>
-        </w:r>
-        <w:proofErr w:type="spellEnd"/>
-      </w:hyperlink>
-      <w:r>
-        <w:t xml:space="preserve"> </w:t>
-      </w:r>
-      <w:r>
-        <w:br/>
-        <w:t xml:space="preserve">LinkedIn: </w:t>
-      </w:r>
-      <w:hyperlink r:id="rId9" w:history="1">
-        <w:r>
-          <w:rPr>
-            <w:rStyle w:val="Hyperlink"/>
-          </w:rPr>
-          <w:t>linkedin.com/in/andrea-marchant-09262a3b6</w:t>
+          <w:t>https://linkedin.com/in/andrea-marchant-09262a3b6</w:t>
         </w:r>
       </w:hyperlink>
-      <w:r>
-        <w:t xml:space="preserve"> </w:t>
-      </w:r>
-    </w:p>
-    <w:p>
-      <w:r>
-        <w:pict w14:anchorId="1DA4660C">
-          <v:rect id="_x0000_i1025" style="width:0;height:1.5pt" o:hralign="center" o:hrstd="t" o:hr="t" fillcolor="#a0a0a0" stroked="f"/>
+    </w:p>
+    <w:p>
+      <w:r>
+        <w:pict w14:anchorId="24BC8D68">
+          <v:rect id="_x0000_i1133" style="width:0;height:1.5pt" o:hralign="center" o:hrstd="t" o:hr="t" fillcolor="#a0a0a0" stroked="f"/>
         </w:pict>
       </w:r>
     </w:p>
@@ -107,18 +82,13 @@
     </w:p>
     <w:p>
       <w:r>
-        <w:t>Product design student at Arizona State University pursuing a B.S. in Graphic Information Technology (User Experience). Experienced designing digital and print products including websites, interactive books, marketing materials, and visual communication systems.</w:t>
-      </w:r>
-    </w:p>
-    <w:p>
-      <w:r>
-        <w:t>Background includes freelance design work and professional administrative roles supporting engineering and tax firms. Skilled in UX/UI design, visual hierarchy, layout systems, and front-end development using HTML and CSS. Interested in product design internships where I can contribute to thoughtful digital products while continuing to grow in UX, interface design, and product development.</w:t>
-      </w:r>
-    </w:p>
-    <w:p>
-      <w:r>
-        <w:pict w14:anchorId="46EB964D">
-          <v:rect id="_x0000_i1026" style="width:0;height:1.5pt" o:hralign="center" o:hrstd="t" o:hr="t" fillcolor="#a0a0a0" stroked="f"/>
+        <w:t>UI/UX design student at Arizona State University with 3+ years of experience in visual design, web design, and technical drafting. Skilled in creating clear, user-focused layouts and translating complex ideas into structured visual systems. Background in both design and administrative roles brings strong attention to detail, organization, and collaboration. Seeking a remote design internship or junior design role to contribute to real projects while continuing to grow in UX and interface design.</w:t>
+      </w:r>
+    </w:p>
+    <w:p>
+      <w:r>
+        <w:pict w14:anchorId="70899776">
+          <v:rect id="_x0000_i1134" style="width:0;height:1.5pt" o:hralign="center" o:hrstd="t" o:hr="t" fillcolor="#a0a0a0" stroked="f"/>
         </w:pict>
       </w:r>
     </w:p>
@@ -134,140 +104,465 @@
           <w:b/>
           <w:bCs/>
         </w:rPr>
-        <w:t>Product Design &amp; UX Projects</w:t>
-      </w:r>
-    </w:p>
-    <w:p>
-      <w:r>
+        <w:t>Skills</w:t>
+      </w:r>
+    </w:p>
+    <w:p>
+      <w:pPr>
         <w:rPr>
           <w:b/>
           <w:bCs/>
         </w:rPr>
-        <w:t>Portfolio Website — Product Design &amp; Front-End Development</w:t>
-      </w:r>
-    </w:p>
-    <w:p>
-      <w:r>
-        <w:t>Designed and developed a responsive portfolio website to showcase design work and UX case studies.</w:t>
-      </w:r>
-    </w:p>
-    <w:p>
-      <w:r>
-        <w:t>• Designed interface layouts and navigation structure in Figma</w:t>
-      </w:r>
-      <w:r>
-        <w:br/>
-        <w:t>• Built responsive front-end using HTML and CSS</w:t>
-      </w:r>
-      <w:r>
-        <w:br/>
-        <w:t>• Structured project case study pages to communicate design thinking</w:t>
-      </w:r>
-      <w:r>
-        <w:br/>
-        <w:t>• Deployed website using GitHub Pages</w:t>
-      </w:r>
-    </w:p>
-    <w:p>
-      <w:r>
-        <w:pict w14:anchorId="56F1EDCD">
-          <v:rect id="_x0000_i1027" style="width:0;height:1.5pt" o:hralign="center" o:hrstd="t" o:hr="t" fillcolor="#a0a0a0" stroked="f"/>
-        </w:pict>
-      </w:r>
-    </w:p>
-    <w:p>
+      </w:pPr>
       <w:r>
         <w:rPr>
           <w:b/>
           <w:bCs/>
         </w:rPr>
-        <w:t>Website Design Projects — UX &amp; Interface Design</w:t>
-      </w:r>
-    </w:p>
-    <w:p>
-      <w:r>
-        <w:t>Designed and built multiple websites using Wix and web authoring tools.</w:t>
-      </w:r>
-    </w:p>
-    <w:p>
-      <w:r>
-        <w:t>• Created page layouts and navigation systems for usability and clarity</w:t>
+        <w:t>Tools</w:t>
+      </w:r>
+    </w:p>
+    <w:p>
+      <w:r>
+        <w:t>Figma (wireframing, layouts)</w:t>
       </w:r>
       <w:r>
         <w:br/>
-        <w:t>• Developed visual branding and content organization</w:t>
+        <w:t>Adobe Illustrator</w:t>
       </w:r>
       <w:r>
         <w:br/>
-        <w:t>• Built websites for independent projects including an engineering company</w:t>
-      </w:r>
-    </w:p>
-    <w:p>
-      <w:r>
+        <w:t>Adobe Photoshop</w:t>
+      </w:r>
+      <w:r>
+        <w:br/>
+        <w:t>Canva (marketing &amp; visual design)</w:t>
+      </w:r>
+      <w:r>
+        <w:br/>
+        <w:t>Wix</w:t>
+      </w:r>
+    </w:p>
+    <w:p>
+      <w:r>
+        <w:pict w14:anchorId="69846B0C">
+          <v:rect id="_x0000_i1135" style="width:0;height:1.5pt" o:hralign="center" o:hrstd="t" o:hr="t" fillcolor="#a0a0a0" stroked="f"/>
+        </w:pict>
+      </w:r>
+    </w:p>
+    <w:p>
+      <w:pPr>
         <w:rPr>
           <w:b/>
           <w:bCs/>
         </w:rPr>
-        <w:lastRenderedPageBreak/>
-        <w:t>Children’s Seek &amp; Find Books — Product Design</w:t>
-      </w:r>
-    </w:p>
-    <w:p>
-      <w:r>
-        <w:t>Designed and published illustrated children’s activity books focused on interactive discovery.</w:t>
-      </w:r>
-    </w:p>
-    <w:p>
-      <w:r>
-        <w:t>• Designed page layouts and visual systems supporting puzzle-based interaction</w:t>
-      </w:r>
-      <w:r>
-        <w:br/>
-        <w:t>• Created engaging discovery experiences for young readers</w:t>
-      </w:r>
-      <w:r>
-        <w:br/>
-        <w:t>• Published and sold books through online platforms</w:t>
-      </w:r>
-    </w:p>
-    <w:p>
-      <w:r>
-        <w:pict w14:anchorId="23A797B2">
-          <v:rect id="_x0000_i1028" style="width:0;height:1.5pt" o:hralign="center" o:hrstd="t" o:hr="t" fillcolor="#a0a0a0" stroked="f"/>
-        </w:pict>
-      </w:r>
-    </w:p>
-    <w:p>
+      </w:pPr>
       <w:r>
         <w:rPr>
           <w:b/>
           <w:bCs/>
         </w:rPr>
-        <w:t>Family History Book Design — Editorial Product Design</w:t>
-      </w:r>
-    </w:p>
-    <w:p>
-      <w:r>
-        <w:t>Designed narrative books combining images, typography, and storytelling.</w:t>
-      </w:r>
-    </w:p>
-    <w:p>
-      <w:r>
-        <w:t>• Organized historical content into structured visual layouts</w:t>
+        <w:t>Web</w:t>
+      </w:r>
+    </w:p>
+    <w:p>
+      <w:r>
+        <w:t>HTML</w:t>
       </w:r>
       <w:r>
         <w:br/>
-        <w:t>• Designed multi-page typography systems supporting long-form reading</w:t>
-      </w:r>
-    </w:p>
-    <w:p>
-      <w:r>
-        <w:pict w14:anchorId="6F73451A">
-          <v:rect id="_x0000_i1029" style="width:0;height:1.5pt" o:hralign="center" o:hrstd="t" o:hr="t" fillcolor="#a0a0a0" stroked="f"/>
+        <w:t>CSS</w:t>
+      </w:r>
+      <w:r>
+        <w:br/>
+        <w:t>Responsive Web Design</w:t>
+      </w:r>
+    </w:p>
+    <w:p>
+      <w:r>
+        <w:pict w14:anchorId="180B9BD4">
+          <v:rect id="_x0000_i1136" style="width:0;height:1.5pt" o:hralign="center" o:hrstd="t" o:hr="t" fillcolor="#a0a0a0" stroked="f"/>
         </w:pict>
       </w:r>
     </w:p>
     <w:p>
+      <w:pPr>
+        <w:rPr>
+          <w:b/>
+          <w:bCs/>
+        </w:rPr>
+      </w:pPr>
+      <w:r>
+        <w:rPr>
+          <w:b/>
+          <w:bCs/>
+        </w:rPr>
+        <w:t>Design</w:t>
+      </w:r>
+    </w:p>
+    <w:p>
+      <w:r>
+        <w:t>UI/UX Design</w:t>
+      </w:r>
+      <w:r>
+        <w:br/>
+        <w:t>Visual Hierarchy</w:t>
+      </w:r>
+      <w:r>
+        <w:br/>
+      </w:r>
+      <w:r>
+        <w:lastRenderedPageBreak/>
+        <w:t>Typography</w:t>
+      </w:r>
+      <w:r>
+        <w:br/>
+        <w:t>Layout Systems</w:t>
+      </w:r>
+      <w:r>
+        <w:br/>
+        <w:t>Information Architecture</w:t>
+      </w:r>
+      <w:r>
+        <w:br/>
+        <w:t>Branding &amp; Identity</w:t>
+      </w:r>
+    </w:p>
+    <w:p>
+      <w:r>
+        <w:pict w14:anchorId="1065E025">
+          <v:rect id="_x0000_i1137" style="width:0;height:1.5pt" o:hralign="center" o:hrstd="t" o:hr="t" fillcolor="#a0a0a0" stroked="f"/>
+        </w:pict>
+      </w:r>
+    </w:p>
+    <w:p>
+      <w:pPr>
+        <w:rPr>
+          <w:b/>
+          <w:bCs/>
+        </w:rPr>
+      </w:pPr>
+      <w:proofErr w:type="gramStart"/>
+      <w:r>
+        <w:rPr>
+          <w:b/>
+          <w:bCs/>
+        </w:rPr>
+        <w:t>Additional</w:t>
+      </w:r>
+      <w:proofErr w:type="gramEnd"/>
+    </w:p>
+    <w:p>
+      <w:r>
+        <w:t>Wireframing</w:t>
+      </w:r>
+      <w:r>
+        <w:br/>
+        <w:t>Prototyping</w:t>
+      </w:r>
+      <w:r>
+        <w:br/>
+        <w:t>User Flows</w:t>
+      </w:r>
+      <w:r>
+        <w:br/>
+        <w:t>Usability</w:t>
+      </w:r>
+    </w:p>
+    <w:p>
+      <w:r>
+        <w:pict w14:anchorId="2F54B3E6">
+          <v:rect id="_x0000_i1138" style="width:0;height:1.5pt" o:hralign="center" o:hrstd="t" o:hr="t" fillcolor="#a0a0a0" stroked="f"/>
+        </w:pict>
+      </w:r>
+    </w:p>
+    <w:p>
+      <w:pPr>
+        <w:rPr>
+          <w:b/>
+          <w:bCs/>
+        </w:rPr>
+      </w:pPr>
+      <w:r>
+        <w:rPr>
+          <w:b/>
+          <w:bCs/>
+        </w:rPr>
+        <w:t>Design &amp; Project Experience</w:t>
+      </w:r>
+    </w:p>
+    <w:p>
+      <w:pPr>
+        <w:rPr>
+          <w:b/>
+          <w:bCs/>
+        </w:rPr>
+      </w:pPr>
+      <w:r>
+        <w:rPr>
+          <w:b/>
+          <w:bCs/>
+        </w:rPr>
+        <w:t>Portfolio Website — UI/UX Design &amp; Front-End Development</w:t>
+      </w:r>
+    </w:p>
+    <w:p>
+      <w:pPr>
+        <w:numPr>
+          <w:ilvl w:val="0"/>
+          <w:numId w:val="14"/>
+        </w:numPr>
+      </w:pPr>
+      <w:r>
+        <w:t xml:space="preserve">Designed and developed a responsive portfolio website to showcase design work and case studies </w:t>
+      </w:r>
+    </w:p>
+    <w:p>
+      <w:pPr>
+        <w:numPr>
+          <w:ilvl w:val="0"/>
+          <w:numId w:val="14"/>
+        </w:numPr>
+      </w:pPr>
+      <w:r>
+        <w:t xml:space="preserve">Created interface layouts and navigation structure in Figma </w:t>
+      </w:r>
+    </w:p>
+    <w:p>
+      <w:pPr>
+        <w:numPr>
+          <w:ilvl w:val="0"/>
+          <w:numId w:val="14"/>
+        </w:numPr>
+      </w:pPr>
+      <w:r>
+        <w:t xml:space="preserve">Built responsive front-end using HTML and CSS </w:t>
+      </w:r>
+    </w:p>
+    <w:p>
+      <w:pPr>
+        <w:numPr>
+          <w:ilvl w:val="0"/>
+          <w:numId w:val="14"/>
+        </w:numPr>
+      </w:pPr>
+      <w:r>
+        <w:t xml:space="preserve">Structured project pages to clearly communicate design thinking </w:t>
+      </w:r>
+    </w:p>
+    <w:p>
+      <w:pPr>
+        <w:numPr>
+          <w:ilvl w:val="0"/>
+          <w:numId w:val="14"/>
+        </w:numPr>
+      </w:pPr>
+      <w:r>
+        <w:t xml:space="preserve">Deployed website using GitHub Pages </w:t>
+      </w:r>
+    </w:p>
+    <w:p>
+      <w:r>
+        <w:pict w14:anchorId="5F864AD5">
+          <v:rect id="_x0000_i1139" style="width:0;height:1.5pt" o:hralign="center" o:hrstd="t" o:hr="t" fillcolor="#a0a0a0" stroked="f"/>
+        </w:pict>
+      </w:r>
+    </w:p>
+    <w:p>
+      <w:pPr>
+        <w:rPr>
+          <w:b/>
+          <w:bCs/>
+        </w:rPr>
+      </w:pPr>
+      <w:r>
+        <w:rPr>
+          <w:b/>
+          <w:bCs/>
+        </w:rPr>
+        <w:t>Website Design Projects — UI/UX &amp; Visual Design</w:t>
+      </w:r>
+    </w:p>
+    <w:p>
+      <w:pPr>
+        <w:numPr>
+          <w:ilvl w:val="0"/>
+          <w:numId w:val="15"/>
+        </w:numPr>
+      </w:pPr>
+      <w:r>
+        <w:t xml:space="preserve">Designed and built multiple websites using Wix and web tools </w:t>
+      </w:r>
+    </w:p>
+    <w:p>
+      <w:pPr>
+        <w:numPr>
+          <w:ilvl w:val="0"/>
+          <w:numId w:val="15"/>
+        </w:numPr>
+      </w:pPr>
+      <w:r>
+        <w:t xml:space="preserve">Created clear page layouts and navigation systems focused on usability </w:t>
+      </w:r>
+    </w:p>
+    <w:p>
+      <w:pPr>
+        <w:numPr>
+          <w:ilvl w:val="0"/>
+          <w:numId w:val="15"/>
+        </w:numPr>
+      </w:pPr>
+      <w:r>
+        <w:t xml:space="preserve">Developed visual branding and content organization </w:t>
+      </w:r>
+    </w:p>
+    <w:p>
+      <w:pPr>
+        <w:numPr>
+          <w:ilvl w:val="0"/>
+          <w:numId w:val="15"/>
+        </w:numPr>
+      </w:pPr>
+      <w:r>
+        <w:t xml:space="preserve">Designed and launched websites for independent projects, including an engineering company </w:t>
+      </w:r>
+    </w:p>
+    <w:p>
+      <w:r>
+        <w:pict w14:anchorId="3DF1A3C6">
+          <v:rect id="_x0000_i1140" style="width:0;height:1.5pt" o:hralign="center" o:hrstd="t" o:hr="t" fillcolor="#a0a0a0" stroked="f"/>
+        </w:pict>
+      </w:r>
+    </w:p>
+    <w:p>
+      <w:pPr>
+        <w:rPr>
+          <w:b/>
+          <w:bCs/>
+        </w:rPr>
+      </w:pPr>
+      <w:r>
+        <w:rPr>
+          <w:b/>
+          <w:bCs/>
+        </w:rPr>
+        <w:t>Children’s Seek &amp; Find Books — Product &amp; Visual Design</w:t>
+      </w:r>
+    </w:p>
+    <w:p>
+      <w:pPr>
+        <w:numPr>
+          <w:ilvl w:val="0"/>
+          <w:numId w:val="16"/>
+        </w:numPr>
+      </w:pPr>
+      <w:r>
+        <w:lastRenderedPageBreak/>
+        <w:t xml:space="preserve">Designed and published interactive children’s activity books </w:t>
+      </w:r>
+    </w:p>
+    <w:p>
+      <w:pPr>
+        <w:numPr>
+          <w:ilvl w:val="0"/>
+          <w:numId w:val="16"/>
+        </w:numPr>
+      </w:pPr>
+      <w:r>
+        <w:t xml:space="preserve">Created page layouts and visual systems supporting discovery-based interaction </w:t>
+      </w:r>
+    </w:p>
+    <w:p>
+      <w:pPr>
+        <w:numPr>
+          <w:ilvl w:val="0"/>
+          <w:numId w:val="16"/>
+        </w:numPr>
+      </w:pPr>
+      <w:r>
+        <w:t xml:space="preserve">Developed engaging visual experiences for young users </w:t>
+      </w:r>
+    </w:p>
+    <w:p>
+      <w:pPr>
+        <w:numPr>
+          <w:ilvl w:val="0"/>
+          <w:numId w:val="16"/>
+        </w:numPr>
+      </w:pPr>
+      <w:r>
+        <w:t xml:space="preserve">Published and distributed products through online platforms </w:t>
+      </w:r>
+    </w:p>
+    <w:p>
+      <w:r>
+        <w:pict w14:anchorId="7A24A6F6">
+          <v:rect id="_x0000_i1141" style="width:0;height:1.5pt" o:hralign="center" o:hrstd="t" o:hr="t" fillcolor="#a0a0a0" stroked="f"/>
+        </w:pict>
+      </w:r>
+    </w:p>
+    <w:p>
+      <w:pPr>
+        <w:rPr>
+          <w:b/>
+          <w:bCs/>
+        </w:rPr>
+      </w:pPr>
+      <w:r>
+        <w:rPr>
+          <w:b/>
+          <w:bCs/>
+        </w:rPr>
+        <w:t>Family History Book — Editorial Design</w:t>
+      </w:r>
+    </w:p>
+    <w:p>
+      <w:pPr>
+        <w:numPr>
+          <w:ilvl w:val="0"/>
+          <w:numId w:val="17"/>
+        </w:numPr>
+      </w:pPr>
+      <w:r>
+        <w:t xml:space="preserve">Designed long-form narrative books combining imagery, typography, and storytelling </w:t>
+      </w:r>
+    </w:p>
+    <w:p>
+      <w:pPr>
+        <w:numPr>
+          <w:ilvl w:val="0"/>
+          <w:numId w:val="17"/>
+        </w:numPr>
+      </w:pPr>
+      <w:r>
+        <w:t xml:space="preserve">Organized historical content into structured, readable layouts </w:t>
+      </w:r>
+    </w:p>
+    <w:p>
+      <w:pPr>
+        <w:numPr>
+          <w:ilvl w:val="0"/>
+          <w:numId w:val="17"/>
+        </w:numPr>
+      </w:pPr>
+      <w:r>
+        <w:t xml:space="preserve">Created typography systems to support extended reading experiences </w:t>
+      </w:r>
+    </w:p>
+    <w:p>
+      <w:r>
+        <w:pict w14:anchorId="6B2628DF">
+          <v:rect id="_x0000_i1142" style="width:0;height:1.5pt" o:hralign="center" o:hrstd="t" o:hr="t" fillcolor="#a0a0a0" stroked="f"/>
+        </w:pict>
+      </w:r>
+    </w:p>
+    <w:p>
+      <w:pPr>
+        <w:rPr>
+          <w:b/>
+          <w:bCs/>
+        </w:rPr>
+      </w:pPr>
       <w:r>
         <w:rPr>
           <w:b/>
@@ -277,23 +572,42 @@
       </w:r>
     </w:p>
     <w:p>
-      <w:r>
-        <w:t>Created promotional graphics including brochures, invitations, event flyers, and posters.</w:t>
-      </w:r>
-    </w:p>
-    <w:p>
-      <w:r>
-        <w:t>• Applied branding, color theory, and typography systems</w:t>
-      </w:r>
-      <w:r>
-        <w:br/>
-        <w:t>• Designed graphics for both digital and print distribution</w:t>
-      </w:r>
-    </w:p>
-    <w:p>
-      <w:r>
-        <w:pict w14:anchorId="342EF48D">
-          <v:rect id="_x0000_i1030" style="width:0;height:1.5pt" o:hralign="center" o:hrstd="t" o:hr="t" fillcolor="#a0a0a0" stroked="f"/>
+      <w:pPr>
+        <w:numPr>
+          <w:ilvl w:val="0"/>
+          <w:numId w:val="18"/>
+        </w:numPr>
+      </w:pPr>
+      <w:r>
+        <w:t xml:space="preserve">Designed brochures, invitations, flyers, and promotional graphics </w:t>
+      </w:r>
+    </w:p>
+    <w:p>
+      <w:pPr>
+        <w:numPr>
+          <w:ilvl w:val="0"/>
+          <w:numId w:val="18"/>
+        </w:numPr>
+      </w:pPr>
+      <w:r>
+        <w:t xml:space="preserve">Applied branding, typography, and color theory across print and digital formats </w:t>
+      </w:r>
+    </w:p>
+    <w:p>
+      <w:pPr>
+        <w:numPr>
+          <w:ilvl w:val="0"/>
+          <w:numId w:val="18"/>
+        </w:numPr>
+      </w:pPr>
+      <w:r>
+        <w:t xml:space="preserve">Created visually consistent materials for events and communications </w:t>
+      </w:r>
+    </w:p>
+    <w:p>
+      <w:r>
+        <w:pict w14:anchorId="31FAD671">
+          <v:rect id="_x0000_i1143" style="width:0;height:1.5pt" o:hralign="center" o:hrstd="t" o:hr="t" fillcolor="#a0a0a0" stroked="f"/>
         </w:pict>
       </w:r>
     </w:p>
@@ -313,6 +627,12 @@
       </w:r>
     </w:p>
     <w:p>
+      <w:pPr>
+        <w:rPr>
+          <w:b/>
+          <w:bCs/>
+        </w:rPr>
+      </w:pPr>
       <w:r>
         <w:rPr>
           <w:b/>
@@ -320,36 +640,153 @@
         </w:rPr>
         <w:t>Office Administrator</w:t>
       </w:r>
-      <w:r>
-        <w:br/>
+    </w:p>
+    <w:p>
+      <w:r>
         <w:t>3P Engineering LLC — Remote | Jul 2024–Present</w:t>
       </w:r>
     </w:p>
     <w:p>
-      <w:r>
-        <w:t>• Support daily operations for a mechanical engineering firm</w:t>
-      </w:r>
-      <w:r>
-        <w:br/>
-        <w:t>• Organize technical documentation, project files, and digital records</w:t>
-      </w:r>
-      <w:r>
-        <w:br/>
-        <w:t>• Assist with workflow coordination and internal reporting</w:t>
-      </w:r>
-      <w:r>
-        <w:br/>
-        <w:t>• Maintain structured digital documentation systems</w:t>
-      </w:r>
-    </w:p>
-    <w:p>
-      <w:r>
-        <w:pict w14:anchorId="086893AD">
-          <v:rect id="_x0000_i1031" style="width:0;height:1.5pt" o:hralign="center" o:hrstd="t" o:hr="t" fillcolor="#a0a0a0" stroked="f"/>
+      <w:pPr>
+        <w:numPr>
+          <w:ilvl w:val="0"/>
+          <w:numId w:val="19"/>
+        </w:numPr>
+      </w:pPr>
+      <w:r>
+        <w:t xml:space="preserve">Support daily operations for a mechanical engineering firm </w:t>
+      </w:r>
+    </w:p>
+    <w:p>
+      <w:pPr>
+        <w:numPr>
+          <w:ilvl w:val="0"/>
+          <w:numId w:val="19"/>
+        </w:numPr>
+      </w:pPr>
+      <w:r>
+        <w:t xml:space="preserve">Organize technical documentation and maintain structured digital systems </w:t>
+      </w:r>
+    </w:p>
+    <w:p>
+      <w:pPr>
+        <w:numPr>
+          <w:ilvl w:val="0"/>
+          <w:numId w:val="19"/>
+        </w:numPr>
+      </w:pPr>
+      <w:r>
+        <w:t xml:space="preserve">Assist with workflow coordination and internal reporting </w:t>
+      </w:r>
+    </w:p>
+    <w:p>
+      <w:pPr>
+        <w:numPr>
+          <w:ilvl w:val="0"/>
+          <w:numId w:val="19"/>
+        </w:numPr>
+      </w:pPr>
+      <w:r>
+        <w:t xml:space="preserve">Collaborate with stakeholders to organize and structure complex project information </w:t>
+      </w:r>
+    </w:p>
+    <w:p>
+      <w:r>
+        <w:pict w14:anchorId="7F018863">
+          <v:rect id="_x0000_i1144" style="width:0;height:1.5pt" o:hralign="center" o:hrstd="t" o:hr="t" fillcolor="#a0a0a0" stroked="f"/>
         </w:pict>
       </w:r>
     </w:p>
     <w:p>
+      <w:pPr>
+        <w:rPr>
+          <w:b/>
+          <w:bCs/>
+        </w:rPr>
+      </w:pPr>
+      <w:r>
+        <w:rPr>
+          <w:b/>
+          <w:bCs/>
+        </w:rPr>
+        <w:t>Mechanical Engineering Drafter (HVAC/Plumbing)</w:t>
+      </w:r>
+    </w:p>
+    <w:p>
+      <w:r>
+        <w:t>3P Engineering LLC — 2015–2018</w:t>
+      </w:r>
+    </w:p>
+    <w:p>
+      <w:pPr>
+        <w:numPr>
+          <w:ilvl w:val="0"/>
+          <w:numId w:val="20"/>
+        </w:numPr>
+      </w:pPr>
+      <w:r>
+        <w:lastRenderedPageBreak/>
+        <w:t xml:space="preserve">Created detailed CAD drawings for HVAC and plumbing systems using AutoCAD </w:t>
+      </w:r>
+    </w:p>
+    <w:p>
+      <w:pPr>
+        <w:numPr>
+          <w:ilvl w:val="0"/>
+          <w:numId w:val="20"/>
+        </w:numPr>
+      </w:pPr>
+      <w:r>
+        <w:t xml:space="preserve">Translated complex engineering requirements into precise, structured technical layouts </w:t>
+      </w:r>
+    </w:p>
+    <w:p>
+      <w:pPr>
+        <w:numPr>
+          <w:ilvl w:val="0"/>
+          <w:numId w:val="20"/>
+        </w:numPr>
+      </w:pPr>
+      <w:r>
+        <w:t xml:space="preserve">Collaborated with engineers to revise and improve design accuracy </w:t>
+      </w:r>
+    </w:p>
+    <w:p>
+      <w:pPr>
+        <w:numPr>
+          <w:ilvl w:val="0"/>
+          <w:numId w:val="20"/>
+        </w:numPr>
+      </w:pPr>
+      <w:r>
+        <w:t xml:space="preserve">Managed revisions and updates based on project feedback and constraints </w:t>
+      </w:r>
+    </w:p>
+    <w:p>
+      <w:pPr>
+        <w:numPr>
+          <w:ilvl w:val="0"/>
+          <w:numId w:val="20"/>
+        </w:numPr>
+      </w:pPr>
+      <w:r>
+        <w:t xml:space="preserve">Maintained organized drawing systems and documentation for project use </w:t>
+      </w:r>
+    </w:p>
+    <w:p>
+      <w:r>
+        <w:pict w14:anchorId="78DA27E9">
+          <v:rect id="_x0000_i1145" style="width:0;height:1.5pt" o:hralign="center" o:hrstd="t" o:hr="t" fillcolor="#a0a0a0" stroked="f"/>
+        </w:pict>
+      </w:r>
+    </w:p>
+    <w:p>
+      <w:pPr>
+        <w:rPr>
+          <w:b/>
+          <w:bCs/>
+        </w:rPr>
+      </w:pPr>
       <w:r>
         <w:rPr>
           <w:b/>
@@ -357,9 +794,8 @@
         </w:rPr>
         <w:t>Administrative Assistant / Receptionist</w:t>
       </w:r>
-      <w:r>
-        <w:br/>
-      </w:r>
+    </w:p>
+    <w:p>
       <w:proofErr w:type="spellStart"/>
       <w:r>
         <w:t>TNWest</w:t>
@@ -370,53 +806,102 @@
       </w:r>
     </w:p>
     <w:p>
-      <w:r>
-        <w:t>• Manage client scheduling, communication, and document organization</w:t>
-      </w:r>
-      <w:r>
-        <w:br/>
-        <w:t>• Maintain confidentiality while handling financial records</w:t>
-      </w:r>
-      <w:r>
-        <w:br/>
-        <w:t>• Prepare reports, correspondence, and administrative documentation</w:t>
-      </w:r>
-    </w:p>
-    <w:p>
-      <w:r>
+      <w:pPr>
+        <w:numPr>
+          <w:ilvl w:val="0"/>
+          <w:numId w:val="21"/>
+        </w:numPr>
+      </w:pPr>
+      <w:r>
+        <w:t xml:space="preserve">Manage client scheduling, communication, and document organization </w:t>
+      </w:r>
+    </w:p>
+    <w:p>
+      <w:pPr>
+        <w:numPr>
+          <w:ilvl w:val="0"/>
+          <w:numId w:val="21"/>
+        </w:numPr>
+      </w:pPr>
+      <w:r>
+        <w:t xml:space="preserve">Maintain confidentiality while handling financial and legal records </w:t>
+      </w:r>
+    </w:p>
+    <w:p>
+      <w:pPr>
+        <w:numPr>
+          <w:ilvl w:val="0"/>
+          <w:numId w:val="21"/>
+        </w:numPr>
+      </w:pPr>
+      <w:r>
+        <w:t xml:space="preserve">Prepare reports, correspondence, and administrative documentation </w:t>
+      </w:r>
+    </w:p>
+    <w:p>
+      <w:r>
+        <w:pict w14:anchorId="643A0FDA">
+          <v:rect id="_x0000_i1146" style="width:0;height:1.5pt" o:hralign="center" o:hrstd="t" o:hr="t" fillcolor="#a0a0a0" stroked="f"/>
+        </w:pict>
+      </w:r>
+    </w:p>
+    <w:p>
+      <w:pPr>
         <w:rPr>
           <w:b/>
           <w:bCs/>
         </w:rPr>
-        <w:lastRenderedPageBreak/>
+      </w:pPr>
+      <w:r>
+        <w:rPr>
+          <w:b/>
+          <w:bCs/>
+        </w:rPr>
         <w:t>Freelance Designer</w:t>
       </w:r>
-      <w:r>
-        <w:br/>
+    </w:p>
+    <w:p>
+      <w:r>
         <w:t>Self-Employed | 2023–Present</w:t>
       </w:r>
     </w:p>
     <w:p>
-      <w:r>
-        <w:t>• Design visual and digital products including books, planners, and marketing materials</w:t>
-      </w:r>
-      <w:r>
-        <w:br/>
-        <w:t>• Create website layouts and branding concepts for independent projects</w:t>
-      </w:r>
-      <w:r>
-        <w:br/>
-        <w:t>• Apply typography, layout systems, and visual hierarchy across print and digital work</w:t>
-      </w:r>
-      <w:r>
-        <w:br/>
-        <w:t>• Collaborate with clients to translate ideas into finished designs</w:t>
-      </w:r>
-    </w:p>
-    <w:p>
-      <w:r>
-        <w:pict w14:anchorId="3089610F">
-          <v:rect id="_x0000_i1032" style="width:0;height:1.5pt" o:hralign="center" o:hrstd="t" o:hr="t" fillcolor="#a0a0a0" stroked="f"/>
+      <w:pPr>
+        <w:numPr>
+          <w:ilvl w:val="0"/>
+          <w:numId w:val="22"/>
+        </w:numPr>
+      </w:pPr>
+      <w:r>
+        <w:t xml:space="preserve">Design digital and print products including books, websites, and marketing materials </w:t>
+      </w:r>
+    </w:p>
+    <w:p>
+      <w:pPr>
+        <w:numPr>
+          <w:ilvl w:val="0"/>
+          <w:numId w:val="22"/>
+        </w:numPr>
+      </w:pPr>
+      <w:r>
+        <w:t xml:space="preserve">Create layout systems, branding concepts, and visual assets </w:t>
+      </w:r>
+    </w:p>
+    <w:p>
+      <w:pPr>
+        <w:numPr>
+          <w:ilvl w:val="0"/>
+          <w:numId w:val="22"/>
+        </w:numPr>
+      </w:pPr>
+      <w:r>
+        <w:t xml:space="preserve">Collaborate with clients to translate ideas into finished designs </w:t>
+      </w:r>
+    </w:p>
+    <w:p>
+      <w:r>
+        <w:pict w14:anchorId="227F01ED">
+          <v:rect id="_x0000_i1147" style="width:0;height:1.5pt" o:hralign="center" o:hrstd="t" o:hr="t" fillcolor="#a0a0a0" stroked="f"/>
         </w:pict>
       </w:r>
     </w:p>
@@ -450,177 +935,6 @@
       <w:r>
         <w:br/>
         <w:t>Expected Graduation: December 2027</w:t>
-      </w:r>
-    </w:p>
-    <w:p>
-      <w:r>
-        <w:t>Relevant Coursework</w:t>
-      </w:r>
-    </w:p>
-    <w:p>
-      <w:r>
-        <w:t>UX Design Foundations</w:t>
-      </w:r>
-      <w:r>
-        <w:br/>
-        <w:t>Visual Communication Design</w:t>
-      </w:r>
-      <w:r>
-        <w:br/>
-        <w:t>Interface Design</w:t>
-      </w:r>
-      <w:r>
-        <w:br/>
-        <w:t>Digital Layout &amp; Typography</w:t>
-      </w:r>
-      <w:r>
-        <w:br/>
-        <w:t>Web Authoring</w:t>
-      </w:r>
-    </w:p>
-    <w:p>
-      <w:r>
-        <w:pict w14:anchorId="215D3818">
-          <v:rect id="_x0000_i1033" style="width:0;height:1.5pt" o:hralign="center" o:hrstd="t" o:hr="t" fillcolor="#a0a0a0" stroked="f"/>
-        </w:pict>
-      </w:r>
-    </w:p>
-    <w:p>
-      <w:pPr>
-        <w:rPr>
-          <w:b/>
-          <w:bCs/>
-        </w:rPr>
-        <w:sectPr>
-          <w:pgSz w:w="12240" w:h="15840"/>
-          <w:pgMar w:top="1440" w:right="1440" w:bottom="1440" w:left="1440" w:header="720" w:footer="720" w:gutter="0"/>
-          <w:cols w:space="720"/>
-          <w:docGrid w:linePitch="360"/>
-        </w:sectPr>
-      </w:pPr>
-    </w:p>
-    <w:p>
-      <w:pPr>
-        <w:rPr>
-          <w:b/>
-          <w:bCs/>
-        </w:rPr>
-      </w:pPr>
-      <w:r>
-        <w:rPr>
-          <w:b/>
-          <w:bCs/>
-        </w:rPr>
-        <w:t>Skills</w:t>
-      </w:r>
-    </w:p>
-    <w:p>
-      <w:r>
-        <w:rPr>
-          <w:b/>
-          <w:bCs/>
-        </w:rPr>
-        <w:t>Product Design &amp; UX</w:t>
-      </w:r>
-    </w:p>
-    <w:p>
-      <w:r>
-        <w:t>User-Centered Design</w:t>
-      </w:r>
-      <w:r>
-        <w:br/>
-        <w:t>Interface Layout Design</w:t>
-      </w:r>
-      <w:r>
-        <w:br/>
-        <w:t>Visual Hierarchy</w:t>
-      </w:r>
-      <w:r>
-        <w:br/>
-        <w:t>Typography</w:t>
-      </w:r>
-      <w:r>
-        <w:br/>
-        <w:t>Information Architecture</w:t>
-      </w:r>
-      <w:r>
-        <w:br/>
-        <w:t>Branding &amp; Identity</w:t>
-      </w:r>
-    </w:p>
-    <w:p>
-      <w:pPr>
-        <w:rPr>
-          <w:b/>
-          <w:bCs/>
-        </w:rPr>
-      </w:pPr>
-    </w:p>
-    <w:p>
-      <w:r>
-        <w:rPr>
-          <w:b/>
-          <w:bCs/>
-        </w:rPr>
-        <w:t>Tools</w:t>
-      </w:r>
-    </w:p>
-    <w:p>
-      <w:r>
-        <w:t>Figma</w:t>
-      </w:r>
-      <w:r>
-        <w:br/>
-        <w:t>Adobe Illustrator</w:t>
-      </w:r>
-      <w:r>
-        <w:br/>
-        <w:t>Adobe Photoshop</w:t>
-      </w:r>
-      <w:r>
-        <w:br/>
-        <w:t>Canva</w:t>
-      </w:r>
-      <w:r>
-        <w:br/>
-        <w:t>Wix</w:t>
-      </w:r>
-    </w:p>
-    <w:p>
-      <w:pPr>
-        <w:sectPr>
-          <w:type w:val="continuous"/>
-          <w:pgSz w:w="12240" w:h="15840"/>
-          <w:pgMar w:top="1440" w:right="1440" w:bottom="1440" w:left="1440" w:header="720" w:footer="720" w:gutter="0"/>
-          <w:cols w:num="2" w:space="720"/>
-          <w:docGrid w:linePitch="360"/>
-        </w:sectPr>
-      </w:pPr>
-    </w:p>
-    <w:p>
-      <w:r>
-        <w:rPr>
-          <w:b/>
-          <w:bCs/>
-        </w:rPr>
-        <w:t>Web</w:t>
-      </w:r>
-    </w:p>
-    <w:p>
-      <w:r>
-        <w:t>HTML</w:t>
-      </w:r>
-      <w:r>
-        <w:br/>
-        <w:t>CSS</w:t>
-      </w:r>
-      <w:r>
-        <w:br/>
-        <w:t>Responsive Web Design</w:t>
-      </w:r>
-      <w:r>
-        <w:br/>
-        <w:t>Website Development</w:t>
       </w:r>
     </w:p>
     <w:p/>
@@ -837,6 +1151,453 @@
     </w:lvl>
   </w:abstractNum>
   <w:abstractNum w:abstractNumId="1" w15:restartNumberingAfterBreak="0">
+    <w:nsid w:val="07BA0A0F"/>
+    <w:multiLevelType w:val="multilevel"/>
+    <w:tmpl w:val="37203514"/>
+    <w:lvl w:ilvl="0">
+      <w:start w:val="1"/>
+      <w:numFmt w:val="bullet"/>
+      <w:lvlText w:val=""/>
+      <w:lvlJc w:val="left"/>
+      <w:pPr>
+        <w:tabs>
+          <w:tab w:val="num" w:pos="720"/>
+        </w:tabs>
+        <w:ind w:left="720" w:hanging="360"/>
+      </w:pPr>
+      <w:rPr>
+        <w:rFonts w:ascii="Symbol" w:hAnsi="Symbol" w:hint="default"/>
+        <w:sz w:val="20"/>
+      </w:rPr>
+    </w:lvl>
+    <w:lvl w:ilvl="1" w:tentative="1">
+      <w:start w:val="1"/>
+      <w:numFmt w:val="bullet"/>
+      <w:lvlText w:val="o"/>
+      <w:lvlJc w:val="left"/>
+      <w:pPr>
+        <w:tabs>
+          <w:tab w:val="num" w:pos="1440"/>
+        </w:tabs>
+        <w:ind w:left="1440" w:hanging="360"/>
+      </w:pPr>
+      <w:rPr>
+        <w:rFonts w:ascii="Courier New" w:hAnsi="Courier New" w:hint="default"/>
+        <w:sz w:val="20"/>
+      </w:rPr>
+    </w:lvl>
+    <w:lvl w:ilvl="2" w:tentative="1">
+      <w:start w:val="1"/>
+      <w:numFmt w:val="bullet"/>
+      <w:lvlText w:val=""/>
+      <w:lvlJc w:val="left"/>
+      <w:pPr>
+        <w:tabs>
+          <w:tab w:val="num" w:pos="2160"/>
+        </w:tabs>
+        <w:ind w:left="2160" w:hanging="360"/>
+      </w:pPr>
+      <w:rPr>
+        <w:rFonts w:ascii="Wingdings" w:hAnsi="Wingdings" w:hint="default"/>
+        <w:sz w:val="20"/>
+      </w:rPr>
+    </w:lvl>
+    <w:lvl w:ilvl="3" w:tentative="1">
+      <w:start w:val="1"/>
+      <w:numFmt w:val="bullet"/>
+      <w:lvlText w:val=""/>
+      <w:lvlJc w:val="left"/>
+      <w:pPr>
+        <w:tabs>
+          <w:tab w:val="num" w:pos="2880"/>
+        </w:tabs>
+        <w:ind w:left="2880" w:hanging="360"/>
+      </w:pPr>
+      <w:rPr>
+        <w:rFonts w:ascii="Wingdings" w:hAnsi="Wingdings" w:hint="default"/>
+        <w:sz w:val="20"/>
+      </w:rPr>
+    </w:lvl>
+    <w:lvl w:ilvl="4" w:tentative="1">
+      <w:start w:val="1"/>
+      <w:numFmt w:val="bullet"/>
+      <w:lvlText w:val=""/>
+      <w:lvlJc w:val="left"/>
+      <w:pPr>
+        <w:tabs>
+          <w:tab w:val="num" w:pos="3600"/>
+        </w:tabs>
+        <w:ind w:left="3600" w:hanging="360"/>
+      </w:pPr>
+      <w:rPr>
+        <w:rFonts w:ascii="Wingdings" w:hAnsi="Wingdings" w:hint="default"/>
+        <w:sz w:val="20"/>
+      </w:rPr>
+    </w:lvl>
+    <w:lvl w:ilvl="5" w:tentative="1">
+      <w:start w:val="1"/>
+      <w:numFmt w:val="bullet"/>
+      <w:lvlText w:val=""/>
+      <w:lvlJc w:val="left"/>
+      <w:pPr>
+        <w:tabs>
+          <w:tab w:val="num" w:pos="4320"/>
+        </w:tabs>
+        <w:ind w:left="4320" w:hanging="360"/>
+      </w:pPr>
+      <w:rPr>
+        <w:rFonts w:ascii="Wingdings" w:hAnsi="Wingdings" w:hint="default"/>
+        <w:sz w:val="20"/>
+      </w:rPr>
+    </w:lvl>
+    <w:lvl w:ilvl="6" w:tentative="1">
+      <w:start w:val="1"/>
+      <w:numFmt w:val="bullet"/>
+      <w:lvlText w:val=""/>
+      <w:lvlJc w:val="left"/>
+      <w:pPr>
+        <w:tabs>
+          <w:tab w:val="num" w:pos="5040"/>
+        </w:tabs>
+        <w:ind w:left="5040" w:hanging="360"/>
+      </w:pPr>
+      <w:rPr>
+        <w:rFonts w:ascii="Wingdings" w:hAnsi="Wingdings" w:hint="default"/>
+        <w:sz w:val="20"/>
+      </w:rPr>
+    </w:lvl>
+    <w:lvl w:ilvl="7" w:tentative="1">
+      <w:start w:val="1"/>
+      <w:numFmt w:val="bullet"/>
+      <w:lvlText w:val=""/>
+      <w:lvlJc w:val="left"/>
+      <w:pPr>
+        <w:tabs>
+          <w:tab w:val="num" w:pos="5760"/>
+        </w:tabs>
+        <w:ind w:left="5760" w:hanging="360"/>
+      </w:pPr>
+      <w:rPr>
+        <w:rFonts w:ascii="Wingdings" w:hAnsi="Wingdings" w:hint="default"/>
+        <w:sz w:val="20"/>
+      </w:rPr>
+    </w:lvl>
+    <w:lvl w:ilvl="8" w:tentative="1">
+      <w:start w:val="1"/>
+      <w:numFmt w:val="bullet"/>
+      <w:lvlText w:val=""/>
+      <w:lvlJc w:val="left"/>
+      <w:pPr>
+        <w:tabs>
+          <w:tab w:val="num" w:pos="6480"/>
+        </w:tabs>
+        <w:ind w:left="6480" w:hanging="360"/>
+      </w:pPr>
+      <w:rPr>
+        <w:rFonts w:ascii="Wingdings" w:hAnsi="Wingdings" w:hint="default"/>
+        <w:sz w:val="20"/>
+      </w:rPr>
+    </w:lvl>
+  </w:abstractNum>
+  <w:abstractNum w:abstractNumId="2" w15:restartNumberingAfterBreak="0">
+    <w:nsid w:val="19F45E40"/>
+    <w:multiLevelType w:val="multilevel"/>
+    <w:tmpl w:val="0D6E9E4E"/>
+    <w:lvl w:ilvl="0">
+      <w:start w:val="1"/>
+      <w:numFmt w:val="bullet"/>
+      <w:lvlText w:val=""/>
+      <w:lvlJc w:val="left"/>
+      <w:pPr>
+        <w:tabs>
+          <w:tab w:val="num" w:pos="720"/>
+        </w:tabs>
+        <w:ind w:left="720" w:hanging="360"/>
+      </w:pPr>
+      <w:rPr>
+        <w:rFonts w:ascii="Symbol" w:hAnsi="Symbol" w:hint="default"/>
+        <w:sz w:val="20"/>
+      </w:rPr>
+    </w:lvl>
+    <w:lvl w:ilvl="1" w:tentative="1">
+      <w:start w:val="1"/>
+      <w:numFmt w:val="bullet"/>
+      <w:lvlText w:val="o"/>
+      <w:lvlJc w:val="left"/>
+      <w:pPr>
+        <w:tabs>
+          <w:tab w:val="num" w:pos="1440"/>
+        </w:tabs>
+        <w:ind w:left="1440" w:hanging="360"/>
+      </w:pPr>
+      <w:rPr>
+        <w:rFonts w:ascii="Courier New" w:hAnsi="Courier New" w:hint="default"/>
+        <w:sz w:val="20"/>
+      </w:rPr>
+    </w:lvl>
+    <w:lvl w:ilvl="2" w:tentative="1">
+      <w:start w:val="1"/>
+      <w:numFmt w:val="bullet"/>
+      <w:lvlText w:val=""/>
+      <w:lvlJc w:val="left"/>
+      <w:pPr>
+        <w:tabs>
+          <w:tab w:val="num" w:pos="2160"/>
+        </w:tabs>
+        <w:ind w:left="2160" w:hanging="360"/>
+      </w:pPr>
+      <w:rPr>
+        <w:rFonts w:ascii="Wingdings" w:hAnsi="Wingdings" w:hint="default"/>
+        <w:sz w:val="20"/>
+      </w:rPr>
+    </w:lvl>
+    <w:lvl w:ilvl="3" w:tentative="1">
+      <w:start w:val="1"/>
+      <w:numFmt w:val="bullet"/>
+      <w:lvlText w:val=""/>
+      <w:lvlJc w:val="left"/>
+      <w:pPr>
+        <w:tabs>
+          <w:tab w:val="num" w:pos="2880"/>
+        </w:tabs>
+        <w:ind w:left="2880" w:hanging="360"/>
+      </w:pPr>
+      <w:rPr>
+        <w:rFonts w:ascii="Wingdings" w:hAnsi="Wingdings" w:hint="default"/>
+        <w:sz w:val="20"/>
+      </w:rPr>
+    </w:lvl>
+    <w:lvl w:ilvl="4" w:tentative="1">
+      <w:start w:val="1"/>
+      <w:numFmt w:val="bullet"/>
+      <w:lvlText w:val=""/>
+      <w:lvlJc w:val="left"/>
+      <w:pPr>
+        <w:tabs>
+          <w:tab w:val="num" w:pos="3600"/>
+        </w:tabs>
+        <w:ind w:left="3600" w:hanging="360"/>
+      </w:pPr>
+      <w:rPr>
+        <w:rFonts w:ascii="Wingdings" w:hAnsi="Wingdings" w:hint="default"/>
+        <w:sz w:val="20"/>
+      </w:rPr>
+    </w:lvl>
+    <w:lvl w:ilvl="5" w:tentative="1">
+      <w:start w:val="1"/>
+      <w:numFmt w:val="bullet"/>
+      <w:lvlText w:val=""/>
+      <w:lvlJc w:val="left"/>
+      <w:pPr>
+        <w:tabs>
+          <w:tab w:val="num" w:pos="4320"/>
+        </w:tabs>
+        <w:ind w:left="4320" w:hanging="360"/>
+      </w:pPr>
+      <w:rPr>
+        <w:rFonts w:ascii="Wingdings" w:hAnsi="Wingdings" w:hint="default"/>
+        <w:sz w:val="20"/>
+      </w:rPr>
+    </w:lvl>
+    <w:lvl w:ilvl="6" w:tentative="1">
+      <w:start w:val="1"/>
+      <w:numFmt w:val="bullet"/>
+      <w:lvlText w:val=""/>
+      <w:lvlJc w:val="left"/>
+      <w:pPr>
+        <w:tabs>
+          <w:tab w:val="num" w:pos="5040"/>
+        </w:tabs>
+        <w:ind w:left="5040" w:hanging="360"/>
+      </w:pPr>
+      <w:rPr>
+        <w:rFonts w:ascii="Wingdings" w:hAnsi="Wingdings" w:hint="default"/>
+        <w:sz w:val="20"/>
+      </w:rPr>
+    </w:lvl>
+    <w:lvl w:ilvl="7" w:tentative="1">
+      <w:start w:val="1"/>
+      <w:numFmt w:val="bullet"/>
+      <w:lvlText w:val=""/>
+      <w:lvlJc w:val="left"/>
+      <w:pPr>
+        <w:tabs>
+          <w:tab w:val="num" w:pos="5760"/>
+        </w:tabs>
+        <w:ind w:left="5760" w:hanging="360"/>
+      </w:pPr>
+      <w:rPr>
+        <w:rFonts w:ascii="Wingdings" w:hAnsi="Wingdings" w:hint="default"/>
+        <w:sz w:val="20"/>
+      </w:rPr>
+    </w:lvl>
+    <w:lvl w:ilvl="8" w:tentative="1">
+      <w:start w:val="1"/>
+      <w:numFmt w:val="bullet"/>
+      <w:lvlText w:val=""/>
+      <w:lvlJc w:val="left"/>
+      <w:pPr>
+        <w:tabs>
+          <w:tab w:val="num" w:pos="6480"/>
+        </w:tabs>
+        <w:ind w:left="6480" w:hanging="360"/>
+      </w:pPr>
+      <w:rPr>
+        <w:rFonts w:ascii="Wingdings" w:hAnsi="Wingdings" w:hint="default"/>
+        <w:sz w:val="20"/>
+      </w:rPr>
+    </w:lvl>
+  </w:abstractNum>
+  <w:abstractNum w:abstractNumId="3" w15:restartNumberingAfterBreak="0">
+    <w:nsid w:val="1AF5668A"/>
+    <w:multiLevelType w:val="multilevel"/>
+    <w:tmpl w:val="F380F616"/>
+    <w:lvl w:ilvl="0">
+      <w:start w:val="1"/>
+      <w:numFmt w:val="bullet"/>
+      <w:lvlText w:val=""/>
+      <w:lvlJc w:val="left"/>
+      <w:pPr>
+        <w:tabs>
+          <w:tab w:val="num" w:pos="720"/>
+        </w:tabs>
+        <w:ind w:left="720" w:hanging="360"/>
+      </w:pPr>
+      <w:rPr>
+        <w:rFonts w:ascii="Symbol" w:hAnsi="Symbol" w:hint="default"/>
+        <w:sz w:val="20"/>
+      </w:rPr>
+    </w:lvl>
+    <w:lvl w:ilvl="1" w:tentative="1">
+      <w:start w:val="1"/>
+      <w:numFmt w:val="bullet"/>
+      <w:lvlText w:val="o"/>
+      <w:lvlJc w:val="left"/>
+      <w:pPr>
+        <w:tabs>
+          <w:tab w:val="num" w:pos="1440"/>
+        </w:tabs>
+        <w:ind w:left="1440" w:hanging="360"/>
+      </w:pPr>
+      <w:rPr>
+        <w:rFonts w:ascii="Courier New" w:hAnsi="Courier New" w:hint="default"/>
+        <w:sz w:val="20"/>
+      </w:rPr>
+    </w:lvl>
+    <w:lvl w:ilvl="2" w:tentative="1">
+      <w:start w:val="1"/>
+      <w:numFmt w:val="bullet"/>
+      <w:lvlText w:val=""/>
+      <w:lvlJc w:val="left"/>
+      <w:pPr>
+        <w:tabs>
+          <w:tab w:val="num" w:pos="2160"/>
+        </w:tabs>
+        <w:ind w:left="2160" w:hanging="360"/>
+      </w:pPr>
+      <w:rPr>
+        <w:rFonts w:ascii="Wingdings" w:hAnsi="Wingdings" w:hint="default"/>
+        <w:sz w:val="20"/>
+      </w:rPr>
+    </w:lvl>
+    <w:lvl w:ilvl="3" w:tentative="1">
+      <w:start w:val="1"/>
+      <w:numFmt w:val="bullet"/>
+      <w:lvlText w:val=""/>
+      <w:lvlJc w:val="left"/>
+      <w:pPr>
+        <w:tabs>
+          <w:tab w:val="num" w:pos="2880"/>
+        </w:tabs>
+        <w:ind w:left="2880" w:hanging="360"/>
+      </w:pPr>
+      <w:rPr>
+        <w:rFonts w:ascii="Wingdings" w:hAnsi="Wingdings" w:hint="default"/>
+        <w:sz w:val="20"/>
+      </w:rPr>
+    </w:lvl>
+    <w:lvl w:ilvl="4" w:tentative="1">
+      <w:start w:val="1"/>
+      <w:numFmt w:val="bullet"/>
+      <w:lvlText w:val=""/>
+      <w:lvlJc w:val="left"/>
+      <w:pPr>
+        <w:tabs>
+          <w:tab w:val="num" w:pos="3600"/>
+        </w:tabs>
+        <w:ind w:left="3600" w:hanging="360"/>
+      </w:pPr>
+      <w:rPr>
+        <w:rFonts w:ascii="Wingdings" w:hAnsi="Wingdings" w:hint="default"/>
+        <w:sz w:val="20"/>
+      </w:rPr>
+    </w:lvl>
+    <w:lvl w:ilvl="5" w:tentative="1">
+      <w:start w:val="1"/>
+      <w:numFmt w:val="bullet"/>
+      <w:lvlText w:val=""/>
+      <w:lvlJc w:val="left"/>
+      <w:pPr>
+        <w:tabs>
+          <w:tab w:val="num" w:pos="4320"/>
+        </w:tabs>
+        <w:ind w:left="4320" w:hanging="360"/>
+      </w:pPr>
+      <w:rPr>
+        <w:rFonts w:ascii="Wingdings" w:hAnsi="Wingdings" w:hint="default"/>
+        <w:sz w:val="20"/>
+      </w:rPr>
+    </w:lvl>
+    <w:lvl w:ilvl="6" w:tentative="1">
+      <w:start w:val="1"/>
+      <w:numFmt w:val="bullet"/>
+      <w:lvlText w:val=""/>
+      <w:lvlJc w:val="left"/>
+      <w:pPr>
+        <w:tabs>
+          <w:tab w:val="num" w:pos="5040"/>
+        </w:tabs>
+        <w:ind w:left="5040" w:hanging="360"/>
+      </w:pPr>
+      <w:rPr>
+        <w:rFonts w:ascii="Wingdings" w:hAnsi="Wingdings" w:hint="default"/>
+        <w:sz w:val="20"/>
+      </w:rPr>
+    </w:lvl>
+    <w:lvl w:ilvl="7" w:tentative="1">
+      <w:start w:val="1"/>
+      <w:numFmt w:val="bullet"/>
+      <w:lvlText w:val=""/>
+      <w:lvlJc w:val="left"/>
+      <w:pPr>
+        <w:tabs>
+          <w:tab w:val="num" w:pos="5760"/>
+        </w:tabs>
+        <w:ind w:left="5760" w:hanging="360"/>
+      </w:pPr>
+      <w:rPr>
+        <w:rFonts w:ascii="Wingdings" w:hAnsi="Wingdings" w:hint="default"/>
+        <w:sz w:val="20"/>
+      </w:rPr>
+    </w:lvl>
+    <w:lvl w:ilvl="8" w:tentative="1">
+      <w:start w:val="1"/>
+      <w:numFmt w:val="bullet"/>
+      <w:lvlText w:val=""/>
+      <w:lvlJc w:val="left"/>
+      <w:pPr>
+        <w:tabs>
+          <w:tab w:val="num" w:pos="6480"/>
+        </w:tabs>
+        <w:ind w:left="6480" w:hanging="360"/>
+      </w:pPr>
+      <w:rPr>
+        <w:rFonts w:ascii="Wingdings" w:hAnsi="Wingdings" w:hint="default"/>
+        <w:sz w:val="20"/>
+      </w:rPr>
+    </w:lvl>
+  </w:abstractNum>
+  <w:abstractNum w:abstractNumId="4" w15:restartNumberingAfterBreak="0">
     <w:nsid w:val="263D3C7E"/>
     <w:multiLevelType w:val="multilevel"/>
     <w:tmpl w:val="F600F686"/>
@@ -985,7 +1746,7 @@
       </w:rPr>
     </w:lvl>
   </w:abstractNum>
-  <w:abstractNum w:abstractNumId="2" w15:restartNumberingAfterBreak="0">
+  <w:abstractNum w:abstractNumId="5" w15:restartNumberingAfterBreak="0">
     <w:nsid w:val="28DF2B25"/>
     <w:multiLevelType w:val="multilevel"/>
     <w:tmpl w:val="C2443D90"/>
@@ -1134,7 +1895,156 @@
       </w:rPr>
     </w:lvl>
   </w:abstractNum>
-  <w:abstractNum w:abstractNumId="3" w15:restartNumberingAfterBreak="0">
+  <w:abstractNum w:abstractNumId="6" w15:restartNumberingAfterBreak="0">
+    <w:nsid w:val="298D5152"/>
+    <w:multiLevelType w:val="multilevel"/>
+    <w:tmpl w:val="04185BDE"/>
+    <w:lvl w:ilvl="0">
+      <w:start w:val="1"/>
+      <w:numFmt w:val="bullet"/>
+      <w:lvlText w:val=""/>
+      <w:lvlJc w:val="left"/>
+      <w:pPr>
+        <w:tabs>
+          <w:tab w:val="num" w:pos="720"/>
+        </w:tabs>
+        <w:ind w:left="720" w:hanging="360"/>
+      </w:pPr>
+      <w:rPr>
+        <w:rFonts w:ascii="Symbol" w:hAnsi="Symbol" w:hint="default"/>
+        <w:sz w:val="20"/>
+      </w:rPr>
+    </w:lvl>
+    <w:lvl w:ilvl="1" w:tentative="1">
+      <w:start w:val="1"/>
+      <w:numFmt w:val="bullet"/>
+      <w:lvlText w:val="o"/>
+      <w:lvlJc w:val="left"/>
+      <w:pPr>
+        <w:tabs>
+          <w:tab w:val="num" w:pos="1440"/>
+        </w:tabs>
+        <w:ind w:left="1440" w:hanging="360"/>
+      </w:pPr>
+      <w:rPr>
+        <w:rFonts w:ascii="Courier New" w:hAnsi="Courier New" w:hint="default"/>
+        <w:sz w:val="20"/>
+      </w:rPr>
+    </w:lvl>
+    <w:lvl w:ilvl="2" w:tentative="1">
+      <w:start w:val="1"/>
+      <w:numFmt w:val="bullet"/>
+      <w:lvlText w:val=""/>
+      <w:lvlJc w:val="left"/>
+      <w:pPr>
+        <w:tabs>
+          <w:tab w:val="num" w:pos="2160"/>
+        </w:tabs>
+        <w:ind w:left="2160" w:hanging="360"/>
+      </w:pPr>
+      <w:rPr>
+        <w:rFonts w:ascii="Wingdings" w:hAnsi="Wingdings" w:hint="default"/>
+        <w:sz w:val="20"/>
+      </w:rPr>
+    </w:lvl>
+    <w:lvl w:ilvl="3" w:tentative="1">
+      <w:start w:val="1"/>
+      <w:numFmt w:val="bullet"/>
+      <w:lvlText w:val=""/>
+      <w:lvlJc w:val="left"/>
+      <w:pPr>
+        <w:tabs>
+          <w:tab w:val="num" w:pos="2880"/>
+        </w:tabs>
+        <w:ind w:left="2880" w:hanging="360"/>
+      </w:pPr>
+      <w:rPr>
+        <w:rFonts w:ascii="Wingdings" w:hAnsi="Wingdings" w:hint="default"/>
+        <w:sz w:val="20"/>
+      </w:rPr>
+    </w:lvl>
+    <w:lvl w:ilvl="4" w:tentative="1">
+      <w:start w:val="1"/>
+      <w:numFmt w:val="bullet"/>
+      <w:lvlText w:val=""/>
+      <w:lvlJc w:val="left"/>
+      <w:pPr>
+        <w:tabs>
+          <w:tab w:val="num" w:pos="3600"/>
+        </w:tabs>
+        <w:ind w:left="3600" w:hanging="360"/>
+      </w:pPr>
+      <w:rPr>
+        <w:rFonts w:ascii="Wingdings" w:hAnsi="Wingdings" w:hint="default"/>
+        <w:sz w:val="20"/>
+      </w:rPr>
+    </w:lvl>
+    <w:lvl w:ilvl="5" w:tentative="1">
+      <w:start w:val="1"/>
+      <w:numFmt w:val="bullet"/>
+      <w:lvlText w:val=""/>
+      <w:lvlJc w:val="left"/>
+      <w:pPr>
+        <w:tabs>
+          <w:tab w:val="num" w:pos="4320"/>
+        </w:tabs>
+        <w:ind w:left="4320" w:hanging="360"/>
+      </w:pPr>
+      <w:rPr>
+        <w:rFonts w:ascii="Wingdings" w:hAnsi="Wingdings" w:hint="default"/>
+        <w:sz w:val="20"/>
+      </w:rPr>
+    </w:lvl>
+    <w:lvl w:ilvl="6" w:tentative="1">
+      <w:start w:val="1"/>
+      <w:numFmt w:val="bullet"/>
+      <w:lvlText w:val=""/>
+      <w:lvlJc w:val="left"/>
+      <w:pPr>
+        <w:tabs>
+          <w:tab w:val="num" w:pos="5040"/>
+        </w:tabs>
+        <w:ind w:left="5040" w:hanging="360"/>
+      </w:pPr>
+      <w:rPr>
+        <w:rFonts w:ascii="Wingdings" w:hAnsi="Wingdings" w:hint="default"/>
+        <w:sz w:val="20"/>
+      </w:rPr>
+    </w:lvl>
+    <w:lvl w:ilvl="7" w:tentative="1">
+      <w:start w:val="1"/>
+      <w:numFmt w:val="bullet"/>
+      <w:lvlText w:val=""/>
+      <w:lvlJc w:val="left"/>
+      <w:pPr>
+        <w:tabs>
+          <w:tab w:val="num" w:pos="5760"/>
+        </w:tabs>
+        <w:ind w:left="5760" w:hanging="360"/>
+      </w:pPr>
+      <w:rPr>
+        <w:rFonts w:ascii="Wingdings" w:hAnsi="Wingdings" w:hint="default"/>
+        <w:sz w:val="20"/>
+      </w:rPr>
+    </w:lvl>
+    <w:lvl w:ilvl="8" w:tentative="1">
+      <w:start w:val="1"/>
+      <w:numFmt w:val="bullet"/>
+      <w:lvlText w:val=""/>
+      <w:lvlJc w:val="left"/>
+      <w:pPr>
+        <w:tabs>
+          <w:tab w:val="num" w:pos="6480"/>
+        </w:tabs>
+        <w:ind w:left="6480" w:hanging="360"/>
+      </w:pPr>
+      <w:rPr>
+        <w:rFonts w:ascii="Wingdings" w:hAnsi="Wingdings" w:hint="default"/>
+        <w:sz w:val="20"/>
+      </w:rPr>
+    </w:lvl>
+  </w:abstractNum>
+  <w:abstractNum w:abstractNumId="7" w15:restartNumberingAfterBreak="0">
     <w:nsid w:val="2B0F23AB"/>
     <w:multiLevelType w:val="multilevel"/>
     <w:tmpl w:val="107CE7E4"/>
@@ -1283,7 +2193,7 @@
       </w:rPr>
     </w:lvl>
   </w:abstractNum>
-  <w:abstractNum w:abstractNumId="4" w15:restartNumberingAfterBreak="0">
+  <w:abstractNum w:abstractNumId="8" w15:restartNumberingAfterBreak="0">
     <w:nsid w:val="33C267AF"/>
     <w:multiLevelType w:val="multilevel"/>
     <w:tmpl w:val="FDFAF5FE"/>
@@ -1432,7 +2342,7 @@
       </w:rPr>
     </w:lvl>
   </w:abstractNum>
-  <w:abstractNum w:abstractNumId="5" w15:restartNumberingAfterBreak="0">
+  <w:abstractNum w:abstractNumId="9" w15:restartNumberingAfterBreak="0">
     <w:nsid w:val="388D46A7"/>
     <w:multiLevelType w:val="multilevel"/>
     <w:tmpl w:val="7CAC4A16"/>
@@ -1581,7 +2491,156 @@
       </w:rPr>
     </w:lvl>
   </w:abstractNum>
-  <w:abstractNum w:abstractNumId="6" w15:restartNumberingAfterBreak="0">
+  <w:abstractNum w:abstractNumId="10" w15:restartNumberingAfterBreak="0">
+    <w:nsid w:val="3C7E70B8"/>
+    <w:multiLevelType w:val="multilevel"/>
+    <w:tmpl w:val="133E7576"/>
+    <w:lvl w:ilvl="0">
+      <w:start w:val="1"/>
+      <w:numFmt w:val="bullet"/>
+      <w:lvlText w:val=""/>
+      <w:lvlJc w:val="left"/>
+      <w:pPr>
+        <w:tabs>
+          <w:tab w:val="num" w:pos="720"/>
+        </w:tabs>
+        <w:ind w:left="720" w:hanging="360"/>
+      </w:pPr>
+      <w:rPr>
+        <w:rFonts w:ascii="Symbol" w:hAnsi="Symbol" w:hint="default"/>
+        <w:sz w:val="20"/>
+      </w:rPr>
+    </w:lvl>
+    <w:lvl w:ilvl="1" w:tentative="1">
+      <w:start w:val="1"/>
+      <w:numFmt w:val="bullet"/>
+      <w:lvlText w:val="o"/>
+      <w:lvlJc w:val="left"/>
+      <w:pPr>
+        <w:tabs>
+          <w:tab w:val="num" w:pos="1440"/>
+        </w:tabs>
+        <w:ind w:left="1440" w:hanging="360"/>
+      </w:pPr>
+      <w:rPr>
+        <w:rFonts w:ascii="Courier New" w:hAnsi="Courier New" w:hint="default"/>
+        <w:sz w:val="20"/>
+      </w:rPr>
+    </w:lvl>
+    <w:lvl w:ilvl="2" w:tentative="1">
+      <w:start w:val="1"/>
+      <w:numFmt w:val="bullet"/>
+      <w:lvlText w:val=""/>
+      <w:lvlJc w:val="left"/>
+      <w:pPr>
+        <w:tabs>
+          <w:tab w:val="num" w:pos="2160"/>
+        </w:tabs>
+        <w:ind w:left="2160" w:hanging="360"/>
+      </w:pPr>
+      <w:rPr>
+        <w:rFonts w:ascii="Wingdings" w:hAnsi="Wingdings" w:hint="default"/>
+        <w:sz w:val="20"/>
+      </w:rPr>
+    </w:lvl>
+    <w:lvl w:ilvl="3" w:tentative="1">
+      <w:start w:val="1"/>
+      <w:numFmt w:val="bullet"/>
+      <w:lvlText w:val=""/>
+      <w:lvlJc w:val="left"/>
+      <w:pPr>
+        <w:tabs>
+          <w:tab w:val="num" w:pos="2880"/>
+        </w:tabs>
+        <w:ind w:left="2880" w:hanging="360"/>
+      </w:pPr>
+      <w:rPr>
+        <w:rFonts w:ascii="Wingdings" w:hAnsi="Wingdings" w:hint="default"/>
+        <w:sz w:val="20"/>
+      </w:rPr>
+    </w:lvl>
+    <w:lvl w:ilvl="4" w:tentative="1">
+      <w:start w:val="1"/>
+      <w:numFmt w:val="bullet"/>
+      <w:lvlText w:val=""/>
+      <w:lvlJc w:val="left"/>
+      <w:pPr>
+        <w:tabs>
+          <w:tab w:val="num" w:pos="3600"/>
+        </w:tabs>
+        <w:ind w:left="3600" w:hanging="360"/>
+      </w:pPr>
+      <w:rPr>
+        <w:rFonts w:ascii="Wingdings" w:hAnsi="Wingdings" w:hint="default"/>
+        <w:sz w:val="20"/>
+      </w:rPr>
+    </w:lvl>
+    <w:lvl w:ilvl="5" w:tentative="1">
+      <w:start w:val="1"/>
+      <w:numFmt w:val="bullet"/>
+      <w:lvlText w:val=""/>
+      <w:lvlJc w:val="left"/>
+      <w:pPr>
+        <w:tabs>
+          <w:tab w:val="num" w:pos="4320"/>
+        </w:tabs>
+        <w:ind w:left="4320" w:hanging="360"/>
+      </w:pPr>
+      <w:rPr>
+        <w:rFonts w:ascii="Wingdings" w:hAnsi="Wingdings" w:hint="default"/>
+        <w:sz w:val="20"/>
+      </w:rPr>
+    </w:lvl>
+    <w:lvl w:ilvl="6" w:tentative="1">
+      <w:start w:val="1"/>
+      <w:numFmt w:val="bullet"/>
+      <w:lvlText w:val=""/>
+      <w:lvlJc w:val="left"/>
+      <w:pPr>
+        <w:tabs>
+          <w:tab w:val="num" w:pos="5040"/>
+        </w:tabs>
+        <w:ind w:left="5040" w:hanging="360"/>
+      </w:pPr>
+      <w:rPr>
+        <w:rFonts w:ascii="Wingdings" w:hAnsi="Wingdings" w:hint="default"/>
+        <w:sz w:val="20"/>
+      </w:rPr>
+    </w:lvl>
+    <w:lvl w:ilvl="7" w:tentative="1">
+      <w:start w:val="1"/>
+      <w:numFmt w:val="bullet"/>
+      <w:lvlText w:val=""/>
+      <w:lvlJc w:val="left"/>
+      <w:pPr>
+        <w:tabs>
+          <w:tab w:val="num" w:pos="5760"/>
+        </w:tabs>
+        <w:ind w:left="5760" w:hanging="360"/>
+      </w:pPr>
+      <w:rPr>
+        <w:rFonts w:ascii="Wingdings" w:hAnsi="Wingdings" w:hint="default"/>
+        <w:sz w:val="20"/>
+      </w:rPr>
+    </w:lvl>
+    <w:lvl w:ilvl="8" w:tentative="1">
+      <w:start w:val="1"/>
+      <w:numFmt w:val="bullet"/>
+      <w:lvlText w:val=""/>
+      <w:lvlJc w:val="left"/>
+      <w:pPr>
+        <w:tabs>
+          <w:tab w:val="num" w:pos="6480"/>
+        </w:tabs>
+        <w:ind w:left="6480" w:hanging="360"/>
+      </w:pPr>
+      <w:rPr>
+        <w:rFonts w:ascii="Wingdings" w:hAnsi="Wingdings" w:hint="default"/>
+        <w:sz w:val="20"/>
+      </w:rPr>
+    </w:lvl>
+  </w:abstractNum>
+  <w:abstractNum w:abstractNumId="11" w15:restartNumberingAfterBreak="0">
     <w:nsid w:val="403D30D4"/>
     <w:multiLevelType w:val="multilevel"/>
     <w:tmpl w:val="CFEACC3A"/>
@@ -1730,7 +2789,7 @@
       </w:rPr>
     </w:lvl>
   </w:abstractNum>
-  <w:abstractNum w:abstractNumId="7" w15:restartNumberingAfterBreak="0">
+  <w:abstractNum w:abstractNumId="12" w15:restartNumberingAfterBreak="0">
     <w:nsid w:val="424A403E"/>
     <w:multiLevelType w:val="multilevel"/>
     <w:tmpl w:val="A9D4B8F8"/>
@@ -1879,7 +2938,7 @@
       </w:rPr>
     </w:lvl>
   </w:abstractNum>
-  <w:abstractNum w:abstractNumId="8" w15:restartNumberingAfterBreak="0">
+  <w:abstractNum w:abstractNumId="13" w15:restartNumberingAfterBreak="0">
     <w:nsid w:val="48B5179E"/>
     <w:multiLevelType w:val="multilevel"/>
     <w:tmpl w:val="585E5F56"/>
@@ -2028,7 +3087,7 @@
       </w:rPr>
     </w:lvl>
   </w:abstractNum>
-  <w:abstractNum w:abstractNumId="9" w15:restartNumberingAfterBreak="0">
+  <w:abstractNum w:abstractNumId="14" w15:restartNumberingAfterBreak="0">
     <w:nsid w:val="49E759D1"/>
     <w:multiLevelType w:val="multilevel"/>
     <w:tmpl w:val="E6DC306C"/>
@@ -2177,7 +3236,156 @@
       </w:rPr>
     </w:lvl>
   </w:abstractNum>
-  <w:abstractNum w:abstractNumId="10" w15:restartNumberingAfterBreak="0">
+  <w:abstractNum w:abstractNumId="15" w15:restartNumberingAfterBreak="0">
+    <w:nsid w:val="4A3402F3"/>
+    <w:multiLevelType w:val="multilevel"/>
+    <w:tmpl w:val="94563C76"/>
+    <w:lvl w:ilvl="0">
+      <w:start w:val="1"/>
+      <w:numFmt w:val="bullet"/>
+      <w:lvlText w:val=""/>
+      <w:lvlJc w:val="left"/>
+      <w:pPr>
+        <w:tabs>
+          <w:tab w:val="num" w:pos="720"/>
+        </w:tabs>
+        <w:ind w:left="720" w:hanging="360"/>
+      </w:pPr>
+      <w:rPr>
+        <w:rFonts w:ascii="Symbol" w:hAnsi="Symbol" w:hint="default"/>
+        <w:sz w:val="20"/>
+      </w:rPr>
+    </w:lvl>
+    <w:lvl w:ilvl="1" w:tentative="1">
+      <w:start w:val="1"/>
+      <w:numFmt w:val="bullet"/>
+      <w:lvlText w:val="o"/>
+      <w:lvlJc w:val="left"/>
+      <w:pPr>
+        <w:tabs>
+          <w:tab w:val="num" w:pos="1440"/>
+        </w:tabs>
+        <w:ind w:left="1440" w:hanging="360"/>
+      </w:pPr>
+      <w:rPr>
+        <w:rFonts w:ascii="Courier New" w:hAnsi="Courier New" w:hint="default"/>
+        <w:sz w:val="20"/>
+      </w:rPr>
+    </w:lvl>
+    <w:lvl w:ilvl="2" w:tentative="1">
+      <w:start w:val="1"/>
+      <w:numFmt w:val="bullet"/>
+      <w:lvlText w:val=""/>
+      <w:lvlJc w:val="left"/>
+      <w:pPr>
+        <w:tabs>
+          <w:tab w:val="num" w:pos="2160"/>
+        </w:tabs>
+        <w:ind w:left="2160" w:hanging="360"/>
+      </w:pPr>
+      <w:rPr>
+        <w:rFonts w:ascii="Wingdings" w:hAnsi="Wingdings" w:hint="default"/>
+        <w:sz w:val="20"/>
+      </w:rPr>
+    </w:lvl>
+    <w:lvl w:ilvl="3" w:tentative="1">
+      <w:start w:val="1"/>
+      <w:numFmt w:val="bullet"/>
+      <w:lvlText w:val=""/>
+      <w:lvlJc w:val="left"/>
+      <w:pPr>
+        <w:tabs>
+          <w:tab w:val="num" w:pos="2880"/>
+        </w:tabs>
+        <w:ind w:left="2880" w:hanging="360"/>
+      </w:pPr>
+      <w:rPr>
+        <w:rFonts w:ascii="Wingdings" w:hAnsi="Wingdings" w:hint="default"/>
+        <w:sz w:val="20"/>
+      </w:rPr>
+    </w:lvl>
+    <w:lvl w:ilvl="4" w:tentative="1">
+      <w:start w:val="1"/>
+      <w:numFmt w:val="bullet"/>
+      <w:lvlText w:val=""/>
+      <w:lvlJc w:val="left"/>
+      <w:pPr>
+        <w:tabs>
+          <w:tab w:val="num" w:pos="3600"/>
+        </w:tabs>
+        <w:ind w:left="3600" w:hanging="360"/>
+      </w:pPr>
+      <w:rPr>
+        <w:rFonts w:ascii="Wingdings" w:hAnsi="Wingdings" w:hint="default"/>
+        <w:sz w:val="20"/>
+      </w:rPr>
+    </w:lvl>
+    <w:lvl w:ilvl="5" w:tentative="1">
+      <w:start w:val="1"/>
+      <w:numFmt w:val="bullet"/>
+      <w:lvlText w:val=""/>
+      <w:lvlJc w:val="left"/>
+      <w:pPr>
+        <w:tabs>
+          <w:tab w:val="num" w:pos="4320"/>
+        </w:tabs>
+        <w:ind w:left="4320" w:hanging="360"/>
+      </w:pPr>
+      <w:rPr>
+        <w:rFonts w:ascii="Wingdings" w:hAnsi="Wingdings" w:hint="default"/>
+        <w:sz w:val="20"/>
+      </w:rPr>
+    </w:lvl>
+    <w:lvl w:ilvl="6" w:tentative="1">
+      <w:start w:val="1"/>
+      <w:numFmt w:val="bullet"/>
+      <w:lvlText w:val=""/>
+      <w:lvlJc w:val="left"/>
+      <w:pPr>
+        <w:tabs>
+          <w:tab w:val="num" w:pos="5040"/>
+        </w:tabs>
+        <w:ind w:left="5040" w:hanging="360"/>
+      </w:pPr>
+      <w:rPr>
+        <w:rFonts w:ascii="Wingdings" w:hAnsi="Wingdings" w:hint="default"/>
+        <w:sz w:val="20"/>
+      </w:rPr>
+    </w:lvl>
+    <w:lvl w:ilvl="7" w:tentative="1">
+      <w:start w:val="1"/>
+      <w:numFmt w:val="bullet"/>
+      <w:lvlText w:val=""/>
+      <w:lvlJc w:val="left"/>
+      <w:pPr>
+        <w:tabs>
+          <w:tab w:val="num" w:pos="5760"/>
+        </w:tabs>
+        <w:ind w:left="5760" w:hanging="360"/>
+      </w:pPr>
+      <w:rPr>
+        <w:rFonts w:ascii="Wingdings" w:hAnsi="Wingdings" w:hint="default"/>
+        <w:sz w:val="20"/>
+      </w:rPr>
+    </w:lvl>
+    <w:lvl w:ilvl="8" w:tentative="1">
+      <w:start w:val="1"/>
+      <w:numFmt w:val="bullet"/>
+      <w:lvlText w:val=""/>
+      <w:lvlJc w:val="left"/>
+      <w:pPr>
+        <w:tabs>
+          <w:tab w:val="num" w:pos="6480"/>
+        </w:tabs>
+        <w:ind w:left="6480" w:hanging="360"/>
+      </w:pPr>
+      <w:rPr>
+        <w:rFonts w:ascii="Wingdings" w:hAnsi="Wingdings" w:hint="default"/>
+        <w:sz w:val="20"/>
+      </w:rPr>
+    </w:lvl>
+  </w:abstractNum>
+  <w:abstractNum w:abstractNumId="16" w15:restartNumberingAfterBreak="0">
     <w:nsid w:val="4BA36333"/>
     <w:multiLevelType w:val="multilevel"/>
     <w:tmpl w:val="B6E2ADD8"/>
@@ -2326,7 +3534,454 @@
       </w:rPr>
     </w:lvl>
   </w:abstractNum>
-  <w:abstractNum w:abstractNumId="11" w15:restartNumberingAfterBreak="0">
+  <w:abstractNum w:abstractNumId="17" w15:restartNumberingAfterBreak="0">
+    <w:nsid w:val="4C0E089A"/>
+    <w:multiLevelType w:val="multilevel"/>
+    <w:tmpl w:val="58C8614A"/>
+    <w:lvl w:ilvl="0">
+      <w:start w:val="1"/>
+      <w:numFmt w:val="bullet"/>
+      <w:lvlText w:val=""/>
+      <w:lvlJc w:val="left"/>
+      <w:pPr>
+        <w:tabs>
+          <w:tab w:val="num" w:pos="720"/>
+        </w:tabs>
+        <w:ind w:left="720" w:hanging="360"/>
+      </w:pPr>
+      <w:rPr>
+        <w:rFonts w:ascii="Symbol" w:hAnsi="Symbol" w:hint="default"/>
+        <w:sz w:val="20"/>
+      </w:rPr>
+    </w:lvl>
+    <w:lvl w:ilvl="1" w:tentative="1">
+      <w:start w:val="1"/>
+      <w:numFmt w:val="bullet"/>
+      <w:lvlText w:val="o"/>
+      <w:lvlJc w:val="left"/>
+      <w:pPr>
+        <w:tabs>
+          <w:tab w:val="num" w:pos="1440"/>
+        </w:tabs>
+        <w:ind w:left="1440" w:hanging="360"/>
+      </w:pPr>
+      <w:rPr>
+        <w:rFonts w:ascii="Courier New" w:hAnsi="Courier New" w:hint="default"/>
+        <w:sz w:val="20"/>
+      </w:rPr>
+    </w:lvl>
+    <w:lvl w:ilvl="2" w:tentative="1">
+      <w:start w:val="1"/>
+      <w:numFmt w:val="bullet"/>
+      <w:lvlText w:val=""/>
+      <w:lvlJc w:val="left"/>
+      <w:pPr>
+        <w:tabs>
+          <w:tab w:val="num" w:pos="2160"/>
+        </w:tabs>
+        <w:ind w:left="2160" w:hanging="360"/>
+      </w:pPr>
+      <w:rPr>
+        <w:rFonts w:ascii="Wingdings" w:hAnsi="Wingdings" w:hint="default"/>
+        <w:sz w:val="20"/>
+      </w:rPr>
+    </w:lvl>
+    <w:lvl w:ilvl="3" w:tentative="1">
+      <w:start w:val="1"/>
+      <w:numFmt w:val="bullet"/>
+      <w:lvlText w:val=""/>
+      <w:lvlJc w:val="left"/>
+      <w:pPr>
+        <w:tabs>
+          <w:tab w:val="num" w:pos="2880"/>
+        </w:tabs>
+        <w:ind w:left="2880" w:hanging="360"/>
+      </w:pPr>
+      <w:rPr>
+        <w:rFonts w:ascii="Wingdings" w:hAnsi="Wingdings" w:hint="default"/>
+        <w:sz w:val="20"/>
+      </w:rPr>
+    </w:lvl>
+    <w:lvl w:ilvl="4" w:tentative="1">
+      <w:start w:val="1"/>
+      <w:numFmt w:val="bullet"/>
+      <w:lvlText w:val=""/>
+      <w:lvlJc w:val="left"/>
+      <w:pPr>
+        <w:tabs>
+          <w:tab w:val="num" w:pos="3600"/>
+        </w:tabs>
+        <w:ind w:left="3600" w:hanging="360"/>
+      </w:pPr>
+      <w:rPr>
+        <w:rFonts w:ascii="Wingdings" w:hAnsi="Wingdings" w:hint="default"/>
+        <w:sz w:val="20"/>
+      </w:rPr>
+    </w:lvl>
+    <w:lvl w:ilvl="5" w:tentative="1">
+      <w:start w:val="1"/>
+      <w:numFmt w:val="bullet"/>
+      <w:lvlText w:val=""/>
+      <w:lvlJc w:val="left"/>
+      <w:pPr>
+        <w:tabs>
+          <w:tab w:val="num" w:pos="4320"/>
+        </w:tabs>
+        <w:ind w:left="4320" w:hanging="360"/>
+      </w:pPr>
+      <w:rPr>
+        <w:rFonts w:ascii="Wingdings" w:hAnsi="Wingdings" w:hint="default"/>
+        <w:sz w:val="20"/>
+      </w:rPr>
+    </w:lvl>
+    <w:lvl w:ilvl="6" w:tentative="1">
+      <w:start w:val="1"/>
+      <w:numFmt w:val="bullet"/>
+      <w:lvlText w:val=""/>
+      <w:lvlJc w:val="left"/>
+      <w:pPr>
+        <w:tabs>
+          <w:tab w:val="num" w:pos="5040"/>
+        </w:tabs>
+        <w:ind w:left="5040" w:hanging="360"/>
+      </w:pPr>
+      <w:rPr>
+        <w:rFonts w:ascii="Wingdings" w:hAnsi="Wingdings" w:hint="default"/>
+        <w:sz w:val="20"/>
+      </w:rPr>
+    </w:lvl>
+    <w:lvl w:ilvl="7" w:tentative="1">
+      <w:start w:val="1"/>
+      <w:numFmt w:val="bullet"/>
+      <w:lvlText w:val=""/>
+      <w:lvlJc w:val="left"/>
+      <w:pPr>
+        <w:tabs>
+          <w:tab w:val="num" w:pos="5760"/>
+        </w:tabs>
+        <w:ind w:left="5760" w:hanging="360"/>
+      </w:pPr>
+      <w:rPr>
+        <w:rFonts w:ascii="Wingdings" w:hAnsi="Wingdings" w:hint="default"/>
+        <w:sz w:val="20"/>
+      </w:rPr>
+    </w:lvl>
+    <w:lvl w:ilvl="8" w:tentative="1">
+      <w:start w:val="1"/>
+      <w:numFmt w:val="bullet"/>
+      <w:lvlText w:val=""/>
+      <w:lvlJc w:val="left"/>
+      <w:pPr>
+        <w:tabs>
+          <w:tab w:val="num" w:pos="6480"/>
+        </w:tabs>
+        <w:ind w:left="6480" w:hanging="360"/>
+      </w:pPr>
+      <w:rPr>
+        <w:rFonts w:ascii="Wingdings" w:hAnsi="Wingdings" w:hint="default"/>
+        <w:sz w:val="20"/>
+      </w:rPr>
+    </w:lvl>
+  </w:abstractNum>
+  <w:abstractNum w:abstractNumId="18" w15:restartNumberingAfterBreak="0">
+    <w:nsid w:val="64C4056B"/>
+    <w:multiLevelType w:val="multilevel"/>
+    <w:tmpl w:val="30188D94"/>
+    <w:lvl w:ilvl="0">
+      <w:start w:val="1"/>
+      <w:numFmt w:val="bullet"/>
+      <w:lvlText w:val=""/>
+      <w:lvlJc w:val="left"/>
+      <w:pPr>
+        <w:tabs>
+          <w:tab w:val="num" w:pos="720"/>
+        </w:tabs>
+        <w:ind w:left="720" w:hanging="360"/>
+      </w:pPr>
+      <w:rPr>
+        <w:rFonts w:ascii="Symbol" w:hAnsi="Symbol" w:hint="default"/>
+        <w:sz w:val="20"/>
+      </w:rPr>
+    </w:lvl>
+    <w:lvl w:ilvl="1" w:tentative="1">
+      <w:start w:val="1"/>
+      <w:numFmt w:val="bullet"/>
+      <w:lvlText w:val="o"/>
+      <w:lvlJc w:val="left"/>
+      <w:pPr>
+        <w:tabs>
+          <w:tab w:val="num" w:pos="1440"/>
+        </w:tabs>
+        <w:ind w:left="1440" w:hanging="360"/>
+      </w:pPr>
+      <w:rPr>
+        <w:rFonts w:ascii="Courier New" w:hAnsi="Courier New" w:hint="default"/>
+        <w:sz w:val="20"/>
+      </w:rPr>
+    </w:lvl>
+    <w:lvl w:ilvl="2" w:tentative="1">
+      <w:start w:val="1"/>
+      <w:numFmt w:val="bullet"/>
+      <w:lvlText w:val=""/>
+      <w:lvlJc w:val="left"/>
+      <w:pPr>
+        <w:tabs>
+          <w:tab w:val="num" w:pos="2160"/>
+        </w:tabs>
+        <w:ind w:left="2160" w:hanging="360"/>
+      </w:pPr>
+      <w:rPr>
+        <w:rFonts w:ascii="Wingdings" w:hAnsi="Wingdings" w:hint="default"/>
+        <w:sz w:val="20"/>
+      </w:rPr>
+    </w:lvl>
+    <w:lvl w:ilvl="3" w:tentative="1">
+      <w:start w:val="1"/>
+      <w:numFmt w:val="bullet"/>
+      <w:lvlText w:val=""/>
+      <w:lvlJc w:val="left"/>
+      <w:pPr>
+        <w:tabs>
+          <w:tab w:val="num" w:pos="2880"/>
+        </w:tabs>
+        <w:ind w:left="2880" w:hanging="360"/>
+      </w:pPr>
+      <w:rPr>
+        <w:rFonts w:ascii="Wingdings" w:hAnsi="Wingdings" w:hint="default"/>
+        <w:sz w:val="20"/>
+      </w:rPr>
+    </w:lvl>
+    <w:lvl w:ilvl="4" w:tentative="1">
+      <w:start w:val="1"/>
+      <w:numFmt w:val="bullet"/>
+      <w:lvlText w:val=""/>
+      <w:lvlJc w:val="left"/>
+      <w:pPr>
+        <w:tabs>
+          <w:tab w:val="num" w:pos="3600"/>
+        </w:tabs>
+        <w:ind w:left="3600" w:hanging="360"/>
+      </w:pPr>
+      <w:rPr>
+        <w:rFonts w:ascii="Wingdings" w:hAnsi="Wingdings" w:hint="default"/>
+        <w:sz w:val="20"/>
+      </w:rPr>
+    </w:lvl>
+    <w:lvl w:ilvl="5" w:tentative="1">
+      <w:start w:val="1"/>
+      <w:numFmt w:val="bullet"/>
+      <w:lvlText w:val=""/>
+      <w:lvlJc w:val="left"/>
+      <w:pPr>
+        <w:tabs>
+          <w:tab w:val="num" w:pos="4320"/>
+        </w:tabs>
+        <w:ind w:left="4320" w:hanging="360"/>
+      </w:pPr>
+      <w:rPr>
+        <w:rFonts w:ascii="Wingdings" w:hAnsi="Wingdings" w:hint="default"/>
+        <w:sz w:val="20"/>
+      </w:rPr>
+    </w:lvl>
+    <w:lvl w:ilvl="6" w:tentative="1">
+      <w:start w:val="1"/>
+      <w:numFmt w:val="bullet"/>
+      <w:lvlText w:val=""/>
+      <w:lvlJc w:val="left"/>
+      <w:pPr>
+        <w:tabs>
+          <w:tab w:val="num" w:pos="5040"/>
+        </w:tabs>
+        <w:ind w:left="5040" w:hanging="360"/>
+      </w:pPr>
+      <w:rPr>
+        <w:rFonts w:ascii="Wingdings" w:hAnsi="Wingdings" w:hint="default"/>
+        <w:sz w:val="20"/>
+      </w:rPr>
+    </w:lvl>
+    <w:lvl w:ilvl="7" w:tentative="1">
+      <w:start w:val="1"/>
+      <w:numFmt w:val="bullet"/>
+      <w:lvlText w:val=""/>
+      <w:lvlJc w:val="left"/>
+      <w:pPr>
+        <w:tabs>
+          <w:tab w:val="num" w:pos="5760"/>
+        </w:tabs>
+        <w:ind w:left="5760" w:hanging="360"/>
+      </w:pPr>
+      <w:rPr>
+        <w:rFonts w:ascii="Wingdings" w:hAnsi="Wingdings" w:hint="default"/>
+        <w:sz w:val="20"/>
+      </w:rPr>
+    </w:lvl>
+    <w:lvl w:ilvl="8" w:tentative="1">
+      <w:start w:val="1"/>
+      <w:numFmt w:val="bullet"/>
+      <w:lvlText w:val=""/>
+      <w:lvlJc w:val="left"/>
+      <w:pPr>
+        <w:tabs>
+          <w:tab w:val="num" w:pos="6480"/>
+        </w:tabs>
+        <w:ind w:left="6480" w:hanging="360"/>
+      </w:pPr>
+      <w:rPr>
+        <w:rFonts w:ascii="Wingdings" w:hAnsi="Wingdings" w:hint="default"/>
+        <w:sz w:val="20"/>
+      </w:rPr>
+    </w:lvl>
+  </w:abstractNum>
+  <w:abstractNum w:abstractNumId="19" w15:restartNumberingAfterBreak="0">
+    <w:nsid w:val="6E4E70DF"/>
+    <w:multiLevelType w:val="multilevel"/>
+    <w:tmpl w:val="C9A6598E"/>
+    <w:lvl w:ilvl="0">
+      <w:start w:val="1"/>
+      <w:numFmt w:val="bullet"/>
+      <w:lvlText w:val=""/>
+      <w:lvlJc w:val="left"/>
+      <w:pPr>
+        <w:tabs>
+          <w:tab w:val="num" w:pos="720"/>
+        </w:tabs>
+        <w:ind w:left="720" w:hanging="360"/>
+      </w:pPr>
+      <w:rPr>
+        <w:rFonts w:ascii="Symbol" w:hAnsi="Symbol" w:hint="default"/>
+        <w:sz w:val="20"/>
+      </w:rPr>
+    </w:lvl>
+    <w:lvl w:ilvl="1" w:tentative="1">
+      <w:start w:val="1"/>
+      <w:numFmt w:val="bullet"/>
+      <w:lvlText w:val="o"/>
+      <w:lvlJc w:val="left"/>
+      <w:pPr>
+        <w:tabs>
+          <w:tab w:val="num" w:pos="1440"/>
+        </w:tabs>
+        <w:ind w:left="1440" w:hanging="360"/>
+      </w:pPr>
+      <w:rPr>
+        <w:rFonts w:ascii="Courier New" w:hAnsi="Courier New" w:hint="default"/>
+        <w:sz w:val="20"/>
+      </w:rPr>
+    </w:lvl>
+    <w:lvl w:ilvl="2" w:tentative="1">
+      <w:start w:val="1"/>
+      <w:numFmt w:val="bullet"/>
+      <w:lvlText w:val=""/>
+      <w:lvlJc w:val="left"/>
+      <w:pPr>
+        <w:tabs>
+          <w:tab w:val="num" w:pos="2160"/>
+        </w:tabs>
+        <w:ind w:left="2160" w:hanging="360"/>
+      </w:pPr>
+      <w:rPr>
+        <w:rFonts w:ascii="Wingdings" w:hAnsi="Wingdings" w:hint="default"/>
+        <w:sz w:val="20"/>
+      </w:rPr>
+    </w:lvl>
+    <w:lvl w:ilvl="3" w:tentative="1">
+      <w:start w:val="1"/>
+      <w:numFmt w:val="bullet"/>
+      <w:lvlText w:val=""/>
+      <w:lvlJc w:val="left"/>
+      <w:pPr>
+        <w:tabs>
+          <w:tab w:val="num" w:pos="2880"/>
+        </w:tabs>
+        <w:ind w:left="2880" w:hanging="360"/>
+      </w:pPr>
+      <w:rPr>
+        <w:rFonts w:ascii="Wingdings" w:hAnsi="Wingdings" w:hint="default"/>
+        <w:sz w:val="20"/>
+      </w:rPr>
+    </w:lvl>
+    <w:lvl w:ilvl="4" w:tentative="1">
+      <w:start w:val="1"/>
+      <w:numFmt w:val="bullet"/>
+      <w:lvlText w:val=""/>
+      <w:lvlJc w:val="left"/>
+      <w:pPr>
+        <w:tabs>
+          <w:tab w:val="num" w:pos="3600"/>
+        </w:tabs>
+        <w:ind w:left="3600" w:hanging="360"/>
+      </w:pPr>
+      <w:rPr>
+        <w:rFonts w:ascii="Wingdings" w:hAnsi="Wingdings" w:hint="default"/>
+        <w:sz w:val="20"/>
+      </w:rPr>
+    </w:lvl>
+    <w:lvl w:ilvl="5" w:tentative="1">
+      <w:start w:val="1"/>
+      <w:numFmt w:val="bullet"/>
+      <w:lvlText w:val=""/>
+      <w:lvlJc w:val="left"/>
+      <w:pPr>
+        <w:tabs>
+          <w:tab w:val="num" w:pos="4320"/>
+        </w:tabs>
+        <w:ind w:left="4320" w:hanging="360"/>
+      </w:pPr>
+      <w:rPr>
+        <w:rFonts w:ascii="Wingdings" w:hAnsi="Wingdings" w:hint="default"/>
+        <w:sz w:val="20"/>
+      </w:rPr>
+    </w:lvl>
+    <w:lvl w:ilvl="6" w:tentative="1">
+      <w:start w:val="1"/>
+      <w:numFmt w:val="bullet"/>
+      <w:lvlText w:val=""/>
+      <w:lvlJc w:val="left"/>
+      <w:pPr>
+        <w:tabs>
+          <w:tab w:val="num" w:pos="5040"/>
+        </w:tabs>
+        <w:ind w:left="5040" w:hanging="360"/>
+      </w:pPr>
+      <w:rPr>
+        <w:rFonts w:ascii="Wingdings" w:hAnsi="Wingdings" w:hint="default"/>
+        <w:sz w:val="20"/>
+      </w:rPr>
+    </w:lvl>
+    <w:lvl w:ilvl="7" w:tentative="1">
+      <w:start w:val="1"/>
+      <w:numFmt w:val="bullet"/>
+      <w:lvlText w:val=""/>
+      <w:lvlJc w:val="left"/>
+      <w:pPr>
+        <w:tabs>
+          <w:tab w:val="num" w:pos="5760"/>
+        </w:tabs>
+        <w:ind w:left="5760" w:hanging="360"/>
+      </w:pPr>
+      <w:rPr>
+        <w:rFonts w:ascii="Wingdings" w:hAnsi="Wingdings" w:hint="default"/>
+        <w:sz w:val="20"/>
+      </w:rPr>
+    </w:lvl>
+    <w:lvl w:ilvl="8" w:tentative="1">
+      <w:start w:val="1"/>
+      <w:numFmt w:val="bullet"/>
+      <w:lvlText w:val=""/>
+      <w:lvlJc w:val="left"/>
+      <w:pPr>
+        <w:tabs>
+          <w:tab w:val="num" w:pos="6480"/>
+        </w:tabs>
+        <w:ind w:left="6480" w:hanging="360"/>
+      </w:pPr>
+      <w:rPr>
+        <w:rFonts w:ascii="Wingdings" w:hAnsi="Wingdings" w:hint="default"/>
+        <w:sz w:val="20"/>
+      </w:rPr>
+    </w:lvl>
+  </w:abstractNum>
+  <w:abstractNum w:abstractNumId="20" w15:restartNumberingAfterBreak="0">
     <w:nsid w:val="72352269"/>
     <w:multiLevelType w:val="multilevel"/>
     <w:tmpl w:val="9A02E9B4"/>
@@ -2475,7 +4130,7 @@
       </w:rPr>
     </w:lvl>
   </w:abstractNum>
-  <w:abstractNum w:abstractNumId="12" w15:restartNumberingAfterBreak="0">
+  <w:abstractNum w:abstractNumId="21" w15:restartNumberingAfterBreak="0">
     <w:nsid w:val="738500FD"/>
     <w:multiLevelType w:val="multilevel"/>
     <w:tmpl w:val="13260D8C"/>
@@ -2625,43 +4280,70 @@
     </w:lvl>
   </w:abstractNum>
   <w:num w:numId="1" w16cid:durableId="1369186364">
-    <w:abstractNumId w:val="3"/>
+    <w:abstractNumId w:val="7"/>
   </w:num>
   <w:num w:numId="2" w16cid:durableId="1962489754">
-    <w:abstractNumId w:val="9"/>
+    <w:abstractNumId w:val="14"/>
   </w:num>
   <w:num w:numId="3" w16cid:durableId="1453938420">
-    <w:abstractNumId w:val="7"/>
+    <w:abstractNumId w:val="12"/>
   </w:num>
   <w:num w:numId="4" w16cid:durableId="226503674">
-    <w:abstractNumId w:val="1"/>
+    <w:abstractNumId w:val="4"/>
   </w:num>
   <w:num w:numId="5" w16cid:durableId="1877082999">
-    <w:abstractNumId w:val="10"/>
+    <w:abstractNumId w:val="16"/>
   </w:num>
   <w:num w:numId="6" w16cid:durableId="141123374">
-    <w:abstractNumId w:val="2"/>
+    <w:abstractNumId w:val="5"/>
   </w:num>
   <w:num w:numId="7" w16cid:durableId="1455640637">
-    <w:abstractNumId w:val="4"/>
+    <w:abstractNumId w:val="8"/>
   </w:num>
   <w:num w:numId="8" w16cid:durableId="1439367893">
     <w:abstractNumId w:val="0"/>
   </w:num>
   <w:num w:numId="9" w16cid:durableId="1586915961">
-    <w:abstractNumId w:val="8"/>
+    <w:abstractNumId w:val="13"/>
   </w:num>
   <w:num w:numId="10" w16cid:durableId="332032168">
-    <w:abstractNumId w:val="12"/>
+    <w:abstractNumId w:val="21"/>
   </w:num>
   <w:num w:numId="11" w16cid:durableId="559562695">
+    <w:abstractNumId w:val="11"/>
+  </w:num>
+  <w:num w:numId="12" w16cid:durableId="357705918">
+    <w:abstractNumId w:val="20"/>
+  </w:num>
+  <w:num w:numId="13" w16cid:durableId="1635209997">
+    <w:abstractNumId w:val="9"/>
+  </w:num>
+  <w:num w:numId="14" w16cid:durableId="1986425050">
     <w:abstractNumId w:val="6"/>
   </w:num>
-  <w:num w:numId="12" w16cid:durableId="357705918">
-    <w:abstractNumId w:val="11"/>
+  <w:num w:numId="15" w16cid:durableId="1644239243">
+    <w:abstractNumId w:val="2"/>
   </w:num>
-  <w:num w:numId="13" w16cid:durableId="1635209997">
-    <w:abstractNumId w:val="5"/>
+  <w:num w:numId="16" w16cid:durableId="523711260">
+    <w:abstractNumId w:val="3"/>
+  </w:num>
+  <w:num w:numId="17" w16cid:durableId="1841121215">
+    <w:abstractNumId w:val="18"/>
+  </w:num>
+  <w:num w:numId="18" w16cid:durableId="1344628956">
+    <w:abstractNumId w:val="10"/>
+  </w:num>
+  <w:num w:numId="19" w16cid:durableId="1704282729">
+    <w:abstractNumId w:val="1"/>
+  </w:num>
+  <w:num w:numId="20" w16cid:durableId="472675197">
+    <w:abstractNumId w:val="19"/>
+  </w:num>
+  <w:num w:numId="21" w16cid:durableId="1781223040">
+    <w:abstractNumId w:val="15"/>
+  </w:num>
+  <w:num w:numId="22" w16cid:durableId="1491949502">
+    <w:abstractNumId w:val="17"/>
   </w:num>
 </w:numbering>
 </file>
@@ -3269,7 +4951,6 @@
   <w:style w:type="character" w:default="1" w:styleId="DefaultParagraphFont">
     <w:name w:val="Default Paragraph Font"/>
     <w:uiPriority w:val="1"/>
-    <w:semiHidden/>
     <w:unhideWhenUsed/>
   </w:style>
   <w:style w:type="table" w:default="1" w:styleId="TableNormal">

</xml_diff>